<commit_message>
test granic genow i fixy
</commit_message>
<xml_diff>
--- a/GDD_zaktualizowany.docx
+++ b/GDD_zaktualizowany.docx
@@ -1405,7 +1405,7 @@
           <w:b/>
           <w:bCs/>
         </w:rPr>
-        <w:t xml:space="preserve">Krok B: Python uruchamia w tle konsolową wersję Unity w trybie wsadowym (-batchmode -nographics). Unity buduje świat na podstawie pliku wejściowego i odpala moduł szybkiej symulacji masowej (20 meczów). </w:t>
+        <w:t xml:space="preserve">Krok B: Python uruchamia w tle konsolową wersję Unity w trybie wsadowym (-batchmode -nographics). Unity buduje świat na podstawie pliku wejściowego i odpala moduł szybkiej symulacji masowej (60 meczów). </w:t>
       </w:r>
     </w:p>
     <w:p>
@@ -1428,7 +1428,7 @@
     </w:p>
     <w:p>
       <w:r>
-        <w:t xml:space="preserve">Każdy mecz ma twardy limit długości wynoszący maxTurnsCap = 500 tur, przy czym za turę uznaje się pojedynczy ruch jednego bota, a boty wykonują je naprzemiennie. Po osiągnięciu limitu rozgrywka jest przerywana bez rozstrzygnięcia, a metryka Game Length wyraża liczbę rozegranych tur jako procent tego limitu. Liczba 20 meczów na jeden zestaw parametrów wynika z konieczności uśrednienia wpływu losowego rozmieszczenia wody, zasobów oraz baz startowych na wynik pojedynczej rozgrywki.</w:t>
+        <w:t xml:space="preserve">Każdy mecz ma twardy limit długości wynoszący maxTurnsCap = 500 tur, przy czym za turę uznaje się pojedynczy ruch jednego bota, a boty wykonują je naprzemiennie. Po osiągnięciu limitu rozgrywka jest przerywana bez rozstrzygnięcia, a metryka Game Length wyraża liczbę rozegranych tur jako procent tego limitu. Liczba 60 meczów na jeden zestaw parametrów wynika z konieczności uśrednienia wpływu losowego rozmieszczenia wody, zasobów oraz baz startowych na wynik pojedynczej rozgrywki. W badaniu pilotażowym opisanym w rozdziale 8.1 wystarczało 20 meczów, ponieważ służyło ono wyłącznie do wyznaczenia rozkładów empirycznych. We właściwym eksperymencie liczbę tę podniesiono do 60, ponieważ pomiar rozkładu zmienności wykazał, że sama mapa odpowiada jedynie za 12–53% różnic między meczami, a pozostała część pochodzi z losowości symulacji; algorytm ewolucyjny musi natomiast rozróżniać konfiguracje różniące się o setne części oceny. Wartość ta jest zapisana w dwóch miejscach jednocześnie — jako batchSimulationCount w scenie Unity oraz jako MECZOW_NA_CHROMOSOM w module pipeline_fuzzy.py — i obie muszą być równe.</w:t>
       </w:r>
     </w:p>
     <w:p>

</xml_diff>

<commit_message>
zmiany metryk zgodnie z wynikami
</commit_message>
<xml_diff>
--- a/GDD_zaktualizowany.docx
+++ b/GDD_zaktualizowany.docx
@@ -1530,9 +1530,8 @@
           <w:b/>
           <w:bCs/>
         </w:rPr>
-        <w:t xml:space="preserve">Kryterium Dynamizmu (Dążenie do maksimum): Wyliczane z trzech wartości — liczby zmian prowadzenia przypadających na 100 tur, Reconquering Rate (wskaźnika ciągłego odbijania frontu) oraz uśrednionych Peak Differences (amplitudy wychyleń przewagi). Jeśli prowadzenie wielokrotnie przechodzi z rąk do rąk, front nieustannie faluje, a wychylenia przewagi pozostają na tyle umiarkowane, by nie przerodzić się w jednostronną dominację — mapa otrzymuje maksymalną notę Dynamizmu. Conquering Rate nie jest już składnikiem tej oceny; pełni wyłącznie rolę bramki poprawności opisanej w rozdziale 7.5.A.</w:t>
-      </w:r>
-      <w:r/>
+        <w:t xml:space="preserve">Kryterium Dynamizmu (Dążenie do maksimum): Wyliczane z dwóch wartości — liczby zmian prowadzenia przypadających na 100 tur oraz Reconquering Rate, czyli wskaźnika ciągłego odbijania frontu. Jeśli prowadzenie wielokrotnie przechodzi z rąk do rąk, a front nieustannie faluje, mapa otrzymuje wysoką ocenę dynamizmu. Punkty kulminacyjne, będące w artykule źródłowym trzecim wejściem tego kryterium, zostały z niego usunięte i pełnią rolę metryki diagnostycznej — uzasadnienie w rozdziale 7.5.D.</w:t>
+      </w:r>
     </w:p>
     <w:p>
       <w:r>
@@ -1540,20 +1539,7 @@
           <w:b/>
           <w:bCs/>
         </w:rPr>
-        <w:t xml:space="preserve">Front Pareto:</w:t>
-      </w:r>
-      <w:r>
-        <w:t xml:space="preserve"> Ponieważ maksymalny balans (gdzie nikt nikogo nie może pokonać z powodu symetrii) naturalnie kłóci się z maksymalnym dynamizmem, algorytm NSGA-II nie szuka jednej mapy. Po zakończeniu ewolucji Python generuje </w:t>
-      </w:r>
-      <w:r>
-        <w:rPr>
-          <w:b/>
-          <w:bCs/>
-        </w:rPr>
-        <w:t xml:space="preserve">Front Pareto</w:t>
-      </w:r>
-      <w:r>
-        <w:t xml:space="preserve"> – zbiór optymalnych konfiguracji map reprezentujących najlepsze możliwe kompromisy projektowe, gotowe do bezpośredniego wykorzystania w Twojej pracy magisterskiej. </w:t>
+        <w:t xml:space="preserve">Front Pareto: Algorytm NSGA-II nie szuka jednej mapy, lecz zbioru rozwiązań niezdominowanych, reprezentujących różne kompromisy między balansem a dynamizmem. Należy przy tym zaznaczyć, że w badanej mechanice oba kryteria okazały się zbieżne, a nie sprzeczne: mapa niezbalansowana rozstrzyga się szybko i jednostronnie, więc jest zarazem mało dynamiczna. Zmierzona korelacja obu ocen wynosi +0,586 przy dynamizmie niezawierającym żadnego składnika mierzącego nierównowagę. W konsekwencji front Pareto degeneruje się do wąskiego zbioru rozwiązań statystycznie nierozróżnialnych, co samo w sobie stanowi wynik badawczy i zostało opisane w pracy.</w:t>
       </w:r>
     </w:p>
     <w:p/>
@@ -2428,10 +2414,7 @@
           <w:b/>
           <w:bCs/>
         </w:rPr>
-        <w:t>Jak liczymy:</w:t>
-      </w:r>
-      <w:r>
-        <w:t xml:space="preserve"> Kod zapamiętuje w słowniku, kto stał na danym kafelku turę wcześniej. Jeśli pole należało do Bota A, a teraz należy do Bota B (lub odwrotnie), licznik currentMatchReconquers rośnie o 1. Na koniec gry dzielimy tę liczbę przez rozmiar lądu i mnożymy razy 100%. Wynik może przekroczyć 100%, jeśli te same pola przechodziły z rąk do rąk wielokrotnie (co oznacza genialną, dynamiczną wojnę pozycyjną). </w:t>
+        <w:t xml:space="preserve">Jak liczymy: Zgodnie ze wzorem (6) z artykułu źródłowego metryka jest średnią przypadającą na jedną turę. Kod zapamiętuje, kto kontrolował dany kafelek turę wcześniej; jeśli pole należało do Bota A, a teraz należy do Bota B lub odwrotnie, licznik przejęć rośnie o 1 (zajmowanie pól neutralnych nie jest tu wliczane). Na koniec meczu sumę przejęć dzielimy przez liczbę pól lądowych oraz przez liczbę rozegranych tur. Wynik eksportowany jest w postaci przeskalowanej do procentu pól zmieniających właściciela w przeliczeniu na 100 tur, co daje liczby czytelne dla człowieka. Wcześniejsza implementacja pomijała dzielenie przez liczbę tur, przez co metryka rosła wprost proporcjonalnie do długości meczu; korelacja z liczbą tur wynosiła wtedy +0,72.</w:t>
       </w:r>
     </w:p>
     <w:p>
@@ -2442,7 +2425,7 @@
         </w:numPr>
       </w:pPr>
       <w:r>
-        <w:t xml:space="preserve">Wartość pożądana: Jak najwyższa (optymalnie powyżej 65%).  </w:t>
+        <w:t xml:space="preserve">Wartość pożądana: Jak najwyższa. Zmierzony rozkład obejmuje przedział od 5,2 do 34,3 procent pól na 100 tur, z medianą 18,4.</w:t>
       </w:r>
     </w:p>
     <w:p>
@@ -2560,7 +2543,7 @@
           <w:b/>
           <w:bCs/>
         </w:rPr>
-        <w:t>Jak liczymy: Zgodnie z artykułem źródłowym, gdzie punkty kulminacyjne stanowią zbiór zmiennych obejmujący wszystkie rozpatrywane zasoby, mierzymy trzy niezależne piki: terytorialny, gospodarczy (zdolność produkcyjna) oraz militarny. W każdej turze wyznaczana jest chwilowa dysproporcja każdej z tych wielkości, a system zapamiętuje najwyższą wartość, jaka wystąpiła w trakcie meczu. Do systemu rozmytego trafia średnia arytmetyczna trzech pików. Badanie pilotażowe wykazało, że korelują one ze sobą na poziomie od +0,87 do +0,94, wobec czego rozdzielanie ich na trzy niezależne wejścia nie wniosłoby dodatkowej informacji, a jedynie rozmyłoby bazę reguł.</w:t>
+        <w:t xml:space="preserve">Jak liczymy: Zgodnie ze wzorem (7) z artykułu źródłowego metryka mierzy amplitudę wahnięcia przewagi, a nie jej głębokość. Dla każdego z trzech zasobów — terytorium, zdolności produkcyjnej i wojska — w każdej turze wyznaczana jest różnica ZE ZNAKIEM, znormalizowana przez sumę stanu posiadania obu botów. System zapamiętuje najwyższą i najniższą wartość, jaka wystąpiła w meczu, a wynikiem jest ich różnica, czyli zakres od 0 do 2, eksportowany jako 0–200%. Do raportu trafia średnia arytmetyczna trzech amplitud; korelują one ze sobą na poziomie od +0,88 do +0,96.</w:t>
       </w:r>
     </w:p>
     <w:p>
@@ -2571,7 +2554,7 @@
         </w:numPr>
       </w:pPr>
       <w:r>
-        <w:t xml:space="preserve">Wartość pożądana: Umiarkowana — zbiór ŚREDNI, w okolicy 62%.  </w:t>
+        <w:t xml:space="preserve">Status metryki: DIAGNOSTYCZNA — mierzona, raportowana i omówiona w pracy, lecz nie stanowi wejścia systemu rozmytego. Powód jest zmierzony, a nie założony. Po wdrożeniu wzoru (7) metryka koreluje z nierównowagą terytorialną na poziomie +0,930, a z wielkościami, które miała opisywać, koreluje ujemnie: −0,304 ze wskaźnikiem odbijania i −0,399 z liczbą bitew polowych. Wzór zakłada bowiem, że gracz znajdujący się w gorszej sytuacji potrafi wrócić do gry; badana mechanika nie zawiera żadnego mechanizmu wyrównywania szans, więc amplituda redukuje się do głębokości ostatecznej dominacji. Pozostawienie tej metryki wśród wejść dynamizmu oznaczałoby albo regułę działającą w kierunku sprzecznym z pomiarem, albo — po odwróceniu kierunku — powtórne mierzenie balansu i sztuczne zawyżenie zgodności obu kryteriów.</w:t>
       </w:r>
     </w:p>
     <w:p>
@@ -6809,7 +6792,7 @@
         <w:ind w:left="720"/>
       </w:pPr>
       <w:r>
-        <w:t xml:space="preserve">Ponieważ na dynamizm wpływają trzy parametry jednocześnie (liczba zmian prowadzenia, Reconquering Rate oraz uśrednione Peak Differences), kompletna baza reguł została ustrukturyzowana w formie trójwymiarowej macierzy decyzyjnej, eliminując ryzyko wystąpienia sytuacji, w której żadna reguła nie zostaje aktywowana:</w:t>
+        <w:t xml:space="preserve">Ponieważ na dynamizm wpływają dwa parametry jednocześnie (liczba zmian prowadzenia oraz Reconquering Rate), kompletna baza reguł została ustrukturyzowana w formie dwuwymiarowej macierzy decyzyjnej, eliminując ryzyko wystąpienia sytuacji, w której żadna reguła nie zostaje aktywowana:</w:t>
       </w:r>
     </w:p>
     <w:tbl>
@@ -6827,7 +6810,6 @@
       <w:tblGrid>
         <w:gridCol w:w="1347"/>
         <w:gridCol w:w="2087"/>
-        <w:gridCol w:w="1920"/>
         <w:gridCol w:w="1652"/>
         <w:gridCol w:w="2050"/>
       </w:tblGrid>
@@ -6915,7 +6897,7 @@
                 <w:lang w:eastAsia="pl-PL"/>
                 <w14:ligatures w14:val="none"/>
               </w:rPr>
-              <w:t>Wskaźnik Odbijania (Reconquering)</w:t>
+              <w:t xml:space="preserve">Wskaźnik Odbijania (Reconquering)</w:t>
             </w:r>
           </w:p>
         </w:tc>
@@ -6956,7 +6938,7 @@
                 <w:lang w:eastAsia="pl-PL"/>
                 <w14:ligatures w14:val="none"/>
               </w:rPr>
-              <w:t>Punkty Kulminacyjne (Peaks)</w:t>
+              <w:t xml:space="preserve">Wynikowy DYNAMIZM Mapy</w:t>
             </w:r>
           </w:p>
         </w:tc>
@@ -6997,48 +6979,7 @@
                 <w:lang w:eastAsia="pl-PL"/>
                 <w14:ligatures w14:val="none"/>
               </w:rPr>
-              <w:t>Wynikowy DYNAMIZM Mapy</w:t>
-            </w:r>
-          </w:p>
-        </w:tc>
-        <w:tc>
-          <w:tcPr>
-            <w:tcW w:w="0" w:type="auto"/>
-            <w:tcBorders>
-              <w:top w:val="single" w:sz="6" w:space="0" w:color="C4C7C5"/>
-              <w:left w:val="single" w:sz="6" w:space="0" w:color="C4C7C5"/>
-              <w:bottom w:val="single" w:sz="6" w:space="0" w:color="C4C7C5"/>
-              <w:right w:val="single" w:sz="6" w:space="0" w:color="C4C7C5"/>
-            </w:tcBorders>
-            <w:tcMar>
-              <w:top w:w="120" w:type="dxa"/>
-              <w:left w:w="180" w:type="dxa"/>
-              <w:bottom w:w="120" w:type="dxa"/>
-              <w:right w:w="180" w:type="dxa"/>
-            </w:tcMar>
-            <w:vAlign w:val="center"/>
-            <w:hideMark/>
-          </w:tcPr>
-          <w:p>
-            <w:pPr>
-              <w:spacing w:after="0" w:line="240" w:lineRule="auto"/>
-              <w:rPr>
-                <w:rFonts w:eastAsia="Times New Roman" w:cs="Arial"/>
-                <w:kern w:val="0"/>
-                <w:lang w:eastAsia="pl-PL"/>
-                <w14:ligatures w14:val="none"/>
-              </w:rPr>
-            </w:pPr>
-            <w:r>
-              <w:rPr>
-                <w:rFonts w:eastAsia="Times New Roman" w:cs="Arial"/>
-                <w:b/>
-                <w:bCs/>
-                <w:kern w:val="0"/>
-                <w:lang w:eastAsia="pl-PL"/>
-                <w14:ligatures w14:val="none"/>
-              </w:rPr>
-              <w:t>Logiczne uzasadnienie oceny</w:t>
+              <w:t xml:space="preserve">Logiczne uzasadnienie oceny</w:t>
             </w:r>
           </w:p>
         </w:tc>
@@ -7084,7 +7025,7 @@
                 <w:lang w:eastAsia="pl-PL"/>
                 <w14:ligatures w14:val="none"/>
               </w:rPr>
-              <w:t>NISKI (LOW)</w:t>
+              <w:t xml:space="preserve">NISKI (LOW)</w:t>
             </w:r>
           </w:p>
         </w:tc>
@@ -7125,7 +7066,7 @@
                 <w:lang w:eastAsia="pl-PL"/>
                 <w14:ligatures w14:val="none"/>
               </w:rPr>
-              <w:t>NISKI (LOW)</w:t>
+              <w:t xml:space="preserve">NISKI (LOW)</w:t>
             </w:r>
           </w:p>
         </w:tc>
@@ -7166,7 +7107,7 @@
                 <w:lang w:eastAsia="pl-PL"/>
                 <w14:ligatures w14:val="none"/>
               </w:rPr>
-              <w:t>NISKI (LOW)</w:t>
+              <w:t xml:space="preserve">NISKI (LOW)</w:t>
             </w:r>
           </w:p>
         </w:tc>
@@ -7201,52 +7142,11 @@
             <w:r>
               <w:rPr>
                 <w:rFonts w:eastAsia="Times New Roman" w:cs="Arial"/>
-                <w:b/>
-                <w:bCs/>
                 <w:kern w:val="0"/>
                 <w:lang w:eastAsia="pl-PL"/>
                 <w14:ligatures w14:val="none"/>
               </w:rPr>
-              <w:t>NISKI (LOW)</w:t>
-            </w:r>
-          </w:p>
-        </w:tc>
-        <w:tc>
-          <w:tcPr>
-            <w:tcW w:w="0" w:type="auto"/>
-            <w:tcBorders>
-              <w:top w:val="single" w:sz="6" w:space="0" w:color="C4C7C5"/>
-              <w:left w:val="single" w:sz="6" w:space="0" w:color="C4C7C5"/>
-              <w:bottom w:val="single" w:sz="6" w:space="0" w:color="C4C7C5"/>
-              <w:right w:val="single" w:sz="6" w:space="0" w:color="C4C7C5"/>
-            </w:tcBorders>
-            <w:tcMar>
-              <w:top w:w="120" w:type="dxa"/>
-              <w:left w:w="180" w:type="dxa"/>
-              <w:bottom w:w="120" w:type="dxa"/>
-              <w:right w:w="180" w:type="dxa"/>
-            </w:tcMar>
-            <w:vAlign w:val="center"/>
-            <w:hideMark/>
-          </w:tcPr>
-          <w:p>
-            <w:pPr>
-              <w:spacing w:after="0" w:line="240" w:lineRule="auto"/>
-              <w:rPr>
-                <w:rFonts w:eastAsia="Times New Roman" w:cs="Arial"/>
-                <w:kern w:val="0"/>
-                <w:lang w:eastAsia="pl-PL"/>
-                <w14:ligatures w14:val="none"/>
-              </w:rPr>
-            </w:pPr>
-            <w:r>
-              <w:rPr>
-                <w:rFonts w:eastAsia="Times New Roman" w:cs="Arial"/>
-                <w:kern w:val="0"/>
-                <w:lang w:eastAsia="pl-PL"/>
-                <w14:ligatures w14:val="none"/>
-              </w:rPr>
-              <w:t>Brak starć, front nieruchomy, przewaga nie drgnęła. Mecz pozbawiony treści.</w:t>
+              <w:t xml:space="preserve">Front stoi w miejscu, a prowadzenie ani razu nie zmienia właściciela. Mecz pozbawiony treści.</w:t>
             </w:r>
           </w:p>
         </w:tc>
@@ -7292,7 +7192,7 @@
                 <w:lang w:eastAsia="pl-PL"/>
                 <w14:ligatures w14:val="none"/>
               </w:rPr>
-              <w:t>NISKI (LOW)</w:t>
+              <w:t xml:space="preserve">NISKI (LOW)</w:t>
             </w:r>
           </w:p>
         </w:tc>
@@ -7333,7 +7233,7 @@
                 <w:lang w:eastAsia="pl-PL"/>
                 <w14:ligatures w14:val="none"/>
               </w:rPr>
-              <w:t>NISKI (LOW)</w:t>
+              <w:t xml:space="preserve">ŚREDNI (MEDIUM)</w:t>
             </w:r>
           </w:p>
         </w:tc>
@@ -7374,7 +7274,7 @@
                 <w:lang w:eastAsia="pl-PL"/>
                 <w14:ligatures w14:val="none"/>
               </w:rPr>
-              <w:t>ŚREDNI (MEDIUM)</w:t>
+              <w:t xml:space="preserve">ŚREDNI (MEDIUM)</w:t>
             </w:r>
           </w:p>
         </w:tc>
@@ -7409,52 +7309,11 @@
             <w:r>
               <w:rPr>
                 <w:rFonts w:eastAsia="Times New Roman" w:cs="Arial"/>
-                <w:b/>
-                <w:bCs/>
                 <w:kern w:val="0"/>
                 <w:lang w:eastAsia="pl-PL"/>
                 <w14:ligatures w14:val="none"/>
               </w:rPr>
-              <w:t>NISKI (LOW)</w:t>
-            </w:r>
-          </w:p>
-        </w:tc>
-        <w:tc>
-          <w:tcPr>
-            <w:tcW w:w="0" w:type="auto"/>
-            <w:tcBorders>
-              <w:top w:val="single" w:sz="6" w:space="0" w:color="C4C7C5"/>
-              <w:left w:val="single" w:sz="6" w:space="0" w:color="C4C7C5"/>
-              <w:bottom w:val="single" w:sz="6" w:space="0" w:color="C4C7C5"/>
-              <w:right w:val="single" w:sz="6" w:space="0" w:color="C4C7C5"/>
-            </w:tcBorders>
-            <w:tcMar>
-              <w:top w:w="120" w:type="dxa"/>
-              <w:left w:w="180" w:type="dxa"/>
-              <w:bottom w:w="120" w:type="dxa"/>
-              <w:right w:w="180" w:type="dxa"/>
-            </w:tcMar>
-            <w:vAlign w:val="center"/>
-            <w:hideMark/>
-          </w:tcPr>
-          <w:p>
-            <w:pPr>
-              <w:spacing w:after="0" w:line="240" w:lineRule="auto"/>
-              <w:rPr>
-                <w:rFonts w:eastAsia="Times New Roman" w:cs="Arial"/>
-                <w:kern w:val="0"/>
-                <w:lang w:eastAsia="pl-PL"/>
-                <w14:ligatures w14:val="none"/>
-              </w:rPr>
-            </w:pPr>
-            <w:r>
-              <w:rPr>
-                <w:rFonts w:eastAsia="Times New Roman" w:cs="Arial"/>
-                <w:kern w:val="0"/>
-                <w:lang w:eastAsia="pl-PL"/>
-                <w14:ligatures w14:val="none"/>
-              </w:rPr>
-              <w:t>Mimo wyraźnego wychylenia przewagi nie doszło ani do walk, ani do przesunięć frontu.</w:t>
+              <w:t xml:space="preserve">Linia frontu umiarkowanie się przesuwa, choć przewaga terytorialna pozostaje po jednej stronie.</w:t>
             </w:r>
           </w:p>
         </w:tc>
@@ -7500,7 +7359,7 @@
                 <w:lang w:eastAsia="pl-PL"/>
                 <w14:ligatures w14:val="none"/>
               </w:rPr>
-              <w:t>NISKI (LOW)</w:t>
+              <w:t xml:space="preserve">NISKI (LOW)</w:t>
             </w:r>
           </w:p>
         </w:tc>
@@ -7541,7 +7400,7 @@
                 <w:lang w:eastAsia="pl-PL"/>
                 <w14:ligatures w14:val="none"/>
               </w:rPr>
-              <w:t>NISKI (LOW)</w:t>
+              <w:t xml:space="preserve">WYSOKI (HIGH)</w:t>
             </w:r>
           </w:p>
         </w:tc>
@@ -7582,7 +7441,7 @@
                 <w:lang w:eastAsia="pl-PL"/>
                 <w14:ligatures w14:val="none"/>
               </w:rPr>
-              <w:t>WYSOKI (HIGH)</w:t>
+              <w:t xml:space="preserve">ŚREDNI (MEDIUM)</w:t>
             </w:r>
           </w:p>
         </w:tc>
@@ -7617,52 +7476,11 @@
             <w:r>
               <w:rPr>
                 <w:rFonts w:eastAsia="Times New Roman" w:cs="Arial"/>
-                <w:b/>
-                <w:bCs/>
                 <w:kern w:val="0"/>
                 <w:lang w:eastAsia="pl-PL"/>
                 <w14:ligatures w14:val="none"/>
               </w:rPr>
-              <w:t>NISKI (LOW)</w:t>
-            </w:r>
-          </w:p>
-        </w:tc>
-        <w:tc>
-          <w:tcPr>
-            <w:tcW w:w="0" w:type="auto"/>
-            <w:tcBorders>
-              <w:top w:val="single" w:sz="6" w:space="0" w:color="C4C7C5"/>
-              <w:left w:val="single" w:sz="6" w:space="0" w:color="C4C7C5"/>
-              <w:bottom w:val="single" w:sz="6" w:space="0" w:color="C4C7C5"/>
-              <w:right w:val="single" w:sz="6" w:space="0" w:color="C4C7C5"/>
-            </w:tcBorders>
-            <w:tcMar>
-              <w:top w:w="120" w:type="dxa"/>
-              <w:left w:w="180" w:type="dxa"/>
-              <w:bottom w:w="120" w:type="dxa"/>
-              <w:right w:w="180" w:type="dxa"/>
-            </w:tcMar>
-            <w:vAlign w:val="center"/>
-            <w:hideMark/>
-          </w:tcPr>
-          <w:p>
-            <w:pPr>
-              <w:spacing w:after="0" w:line="240" w:lineRule="auto"/>
-              <w:rPr>
-                <w:rFonts w:eastAsia="Times New Roman" w:cs="Arial"/>
-                <w:kern w:val="0"/>
-                <w:lang w:eastAsia="pl-PL"/>
-                <w14:ligatures w14:val="none"/>
-              </w:rPr>
-            </w:pPr>
-            <w:r>
-              <w:rPr>
-                <w:rFonts w:eastAsia="Times New Roman" w:cs="Arial"/>
-                <w:kern w:val="0"/>
-                <w:lang w:eastAsia="pl-PL"/>
-                <w14:ligatures w14:val="none"/>
-              </w:rPr>
-              <w:t>Jednostronna dominacja bez walki. Jeden bot rozwinął się w spokoju, drugi nie zareagował.</w:t>
+              <w:t xml:space="preserve">Intensywna wymiana pól granicznych, ale jeden bot prowadzi przez cały mecz.</w:t>
             </w:r>
           </w:p>
         </w:tc>
@@ -7708,7 +7526,7 @@
                 <w:lang w:eastAsia="pl-PL"/>
                 <w14:ligatures w14:val="none"/>
               </w:rPr>
-              <w:t>NISKI (LOW)</w:t>
+              <w:t xml:space="preserve">WYSOKI (HIGH)</w:t>
             </w:r>
           </w:p>
         </w:tc>
@@ -7749,7 +7567,7 @@
                 <w:lang w:eastAsia="pl-PL"/>
                 <w14:ligatures w14:val="none"/>
               </w:rPr>
-              <w:t>ŚREDNI (MEDIUM)</w:t>
+              <w:t xml:space="preserve">NISKI (LOW)</w:t>
             </w:r>
           </w:p>
         </w:tc>
@@ -7790,7 +7608,7 @@
                 <w:lang w:eastAsia="pl-PL"/>
                 <w14:ligatures w14:val="none"/>
               </w:rPr>
-              <w:t>NISKI (LOW)</w:t>
+              <w:t xml:space="preserve">ŚREDNI (MEDIUM)</w:t>
             </w:r>
           </w:p>
         </w:tc>
@@ -7825,52 +7643,11 @@
             <w:r>
               <w:rPr>
                 <w:rFonts w:eastAsia="Times New Roman" w:cs="Arial"/>
-                <w:b/>
-                <w:bCs/>
                 <w:kern w:val="0"/>
                 <w:lang w:eastAsia="pl-PL"/>
                 <w14:ligatures w14:val="none"/>
               </w:rPr>
-              <w:t>ŚREDNI (MEDIUM)</w:t>
-            </w:r>
-          </w:p>
-        </w:tc>
-        <w:tc>
-          <w:tcPr>
-            <w:tcW w:w="0" w:type="auto"/>
-            <w:tcBorders>
-              <w:top w:val="single" w:sz="6" w:space="0" w:color="C4C7C5"/>
-              <w:left w:val="single" w:sz="6" w:space="0" w:color="C4C7C5"/>
-              <w:bottom w:val="single" w:sz="6" w:space="0" w:color="C4C7C5"/>
-              <w:right w:val="single" w:sz="6" w:space="0" w:color="C4C7C5"/>
-            </w:tcBorders>
-            <w:tcMar>
-              <w:top w:w="120" w:type="dxa"/>
-              <w:left w:w="180" w:type="dxa"/>
-              <w:bottom w:w="120" w:type="dxa"/>
-              <w:right w:w="180" w:type="dxa"/>
-            </w:tcMar>
-            <w:vAlign w:val="center"/>
-            <w:hideMark/>
-          </w:tcPr>
-          <w:p>
-            <w:pPr>
-              <w:spacing w:after="0" w:line="240" w:lineRule="auto"/>
-              <w:rPr>
-                <w:rFonts w:eastAsia="Times New Roman" w:cs="Arial"/>
-                <w:kern w:val="0"/>
-                <w:lang w:eastAsia="pl-PL"/>
-                <w14:ligatures w14:val="none"/>
-              </w:rPr>
-            </w:pPr>
-            <w:r>
-              <w:rPr>
-                <w:rFonts w:eastAsia="Times New Roman" w:cs="Arial"/>
-                <w:kern w:val="0"/>
-                <w:lang w:eastAsia="pl-PL"/>
-                <w14:ligatures w14:val="none"/>
-              </w:rPr>
-              <w:t>Front umiarkowanie się przesuwa, choć armie rzadko wchodzą ze sobą w kontakt.</w:t>
+              <w:t xml:space="preserve">Prowadzenie wielokrotnie się odwraca, lecz sama linia frontu pozostaje nieruchoma.</w:t>
             </w:r>
           </w:p>
         </w:tc>
@@ -7916,7 +7693,7 @@
                 <w:lang w:eastAsia="pl-PL"/>
                 <w14:ligatures w14:val="none"/>
               </w:rPr>
-              <w:t>NISKI (LOW)</w:t>
+              <w:t xml:space="preserve">WYSOKI (HIGH)</w:t>
             </w:r>
           </w:p>
         </w:tc>
@@ -7957,7 +7734,7 @@
                 <w:lang w:eastAsia="pl-PL"/>
                 <w14:ligatures w14:val="none"/>
               </w:rPr>
-              <w:t>ŚREDNI (MEDIUM)</w:t>
+              <w:t xml:space="preserve">ŚREDNI (MEDIUM)</w:t>
             </w:r>
           </w:p>
         </w:tc>
@@ -7998,7 +7775,7 @@
                 <w:lang w:eastAsia="pl-PL"/>
                 <w14:ligatures w14:val="none"/>
               </w:rPr>
-              <w:t>ŚREDNI (MEDIUM)</w:t>
+              <w:t xml:space="preserve">WYSOKI (HIGH)</w:t>
             </w:r>
           </w:p>
         </w:tc>
@@ -8033,52 +7810,11 @@
             <w:r>
               <w:rPr>
                 <w:rFonts w:eastAsia="Times New Roman" w:cs="Arial"/>
-                <w:b/>
-                <w:bCs/>
                 <w:kern w:val="0"/>
                 <w:lang w:eastAsia="pl-PL"/>
                 <w14:ligatures w14:val="none"/>
               </w:rPr>
-              <w:t>ŚREDNI (MEDIUM)</w:t>
-            </w:r>
-          </w:p>
-        </w:tc>
-        <w:tc>
-          <w:tcPr>
-            <w:tcW w:w="0" w:type="auto"/>
-            <w:tcBorders>
-              <w:top w:val="single" w:sz="6" w:space="0" w:color="C4C7C5"/>
-              <w:left w:val="single" w:sz="6" w:space="0" w:color="C4C7C5"/>
-              <w:bottom w:val="single" w:sz="6" w:space="0" w:color="C4C7C5"/>
-              <w:right w:val="single" w:sz="6" w:space="0" w:color="C4C7C5"/>
-            </w:tcBorders>
-            <w:tcMar>
-              <w:top w:w="120" w:type="dxa"/>
-              <w:left w:w="180" w:type="dxa"/>
-              <w:bottom w:w="120" w:type="dxa"/>
-              <w:right w:w="180" w:type="dxa"/>
-            </w:tcMar>
-            <w:vAlign w:val="center"/>
-            <w:hideMark/>
-          </w:tcPr>
-          <w:p>
-            <w:pPr>
-              <w:spacing w:after="0" w:line="240" w:lineRule="auto"/>
-              <w:rPr>
-                <w:rFonts w:eastAsia="Times New Roman" w:cs="Arial"/>
-                <w:kern w:val="0"/>
-                <w:lang w:eastAsia="pl-PL"/>
-                <w14:ligatures w14:val="none"/>
-              </w:rPr>
-            </w:pPr>
-            <w:r>
-              <w:rPr>
-                <w:rFonts w:eastAsia="Times New Roman" w:cs="Arial"/>
-                <w:kern w:val="0"/>
-                <w:lang w:eastAsia="pl-PL"/>
-                <w14:ligatures w14:val="none"/>
-              </w:rPr>
-              <w:t>Umiarkowany ruch frontu połączony z wyraźnym, lecz odwracalnym wychyleniem przewagi.</w:t>
+              <w:t xml:space="preserve">Odwrócenia losów meczu połączone z ruchomą linią frontu.</w:t>
             </w:r>
           </w:p>
         </w:tc>
@@ -8125,7 +7861,7 @@
                 <w14:ligatures w14:val="none"/>
               </w:rPr>
               <w:lastRenderedPageBreak/>
-              <w:t>NISKI (LOW)</w:t>
+              <w:t xml:space="preserve">WYSOKI (HIGH)</w:t>
             </w:r>
           </w:p>
         </w:tc>
@@ -8166,7 +7902,7 @@
                 <w:lang w:eastAsia="pl-PL"/>
                 <w14:ligatures w14:val="none"/>
               </w:rPr>
-              <w:t>ŚREDNI (MEDIUM)</w:t>
+              <w:t xml:space="preserve">WYSOKI (HIGH)</w:t>
             </w:r>
           </w:p>
         </w:tc>
@@ -8207,7 +7943,7 @@
                 <w:lang w:eastAsia="pl-PL"/>
                 <w14:ligatures w14:val="none"/>
               </w:rPr>
-              <w:t>WYSOKI (HIGH)</w:t>
+              <w:t xml:space="preserve">WYSOKI (HIGH)</w:t>
             </w:r>
           </w:p>
         </w:tc>
@@ -8242,2552 +7978,11 @@
             <w:r>
               <w:rPr>
                 <w:rFonts w:eastAsia="Times New Roman" w:cs="Arial"/>
-                <w:b/>
-                <w:bCs/>
                 <w:kern w:val="0"/>
                 <w:lang w:eastAsia="pl-PL"/>
                 <w14:ligatures w14:val="none"/>
               </w:rPr>
-              <w:t>NISKI (LOW)</w:t>
-            </w:r>
-          </w:p>
-        </w:tc>
-        <w:tc>
-          <w:tcPr>
-            <w:tcW w:w="0" w:type="auto"/>
-            <w:tcBorders>
-              <w:top w:val="single" w:sz="6" w:space="0" w:color="C4C7C5"/>
-              <w:left w:val="single" w:sz="6" w:space="0" w:color="C4C7C5"/>
-              <w:bottom w:val="single" w:sz="6" w:space="0" w:color="C4C7C5"/>
-              <w:right w:val="single" w:sz="6" w:space="0" w:color="C4C7C5"/>
-            </w:tcBorders>
-            <w:tcMar>
-              <w:top w:w="120" w:type="dxa"/>
-              <w:left w:w="180" w:type="dxa"/>
-              <w:bottom w:w="120" w:type="dxa"/>
-              <w:right w:w="180" w:type="dxa"/>
-            </w:tcMar>
-            <w:vAlign w:val="center"/>
-            <w:hideMark/>
-          </w:tcPr>
-          <w:p>
-            <w:pPr>
-              <w:spacing w:after="0" w:line="240" w:lineRule="auto"/>
-              <w:rPr>
-                <w:rFonts w:eastAsia="Times New Roman" w:cs="Arial"/>
-                <w:kern w:val="0"/>
-                <w:lang w:eastAsia="pl-PL"/>
-                <w14:ligatures w14:val="none"/>
-              </w:rPr>
-            </w:pPr>
-            <w:r>
-              <w:rPr>
-                <w:rFonts w:eastAsia="Times New Roman" w:cs="Arial"/>
-                <w:kern w:val="0"/>
-                <w:lang w:eastAsia="pl-PL"/>
-                <w14:ligatures w14:val="none"/>
-              </w:rPr>
-              <w:t>Przewaga urosła do poziomu dominacji, nie towarzyszyły temu ani walki, ani wymiana pól.</w:t>
-            </w:r>
-          </w:p>
-        </w:tc>
-      </w:tr>
-      <w:tr>
-        <w:trPr>
-          <w:tblCellSpacing w:w="15" w:type="dxa"/>
-        </w:trPr>
-        <w:tc>
-          <w:tcPr>
-            <w:tcW w:w="0" w:type="auto"/>
-            <w:tcBorders>
-              <w:top w:val="single" w:sz="6" w:space="0" w:color="C4C7C5"/>
-              <w:left w:val="single" w:sz="6" w:space="0" w:color="C4C7C5"/>
-              <w:bottom w:val="single" w:sz="6" w:space="0" w:color="C4C7C5"/>
-              <w:right w:val="single" w:sz="6" w:space="0" w:color="C4C7C5"/>
-            </w:tcBorders>
-            <w:tcMar>
-              <w:top w:w="120" w:type="dxa"/>
-              <w:left w:w="180" w:type="dxa"/>
-              <w:bottom w:w="120" w:type="dxa"/>
-              <w:right w:w="180" w:type="dxa"/>
-            </w:tcMar>
-            <w:vAlign w:val="center"/>
-            <w:hideMark/>
-          </w:tcPr>
-          <w:p>
-            <w:pPr>
-              <w:spacing w:after="0" w:line="240" w:lineRule="auto"/>
-              <w:rPr>
-                <w:rFonts w:eastAsia="Times New Roman" w:cs="Arial"/>
-                <w:kern w:val="0"/>
-                <w:lang w:eastAsia="pl-PL"/>
-                <w14:ligatures w14:val="none"/>
-              </w:rPr>
-            </w:pPr>
-            <w:r>
-              <w:rPr>
-                <w:rFonts w:eastAsia="Times New Roman" w:cs="Arial"/>
-                <w:b/>
-                <w:bCs/>
-                <w:kern w:val="0"/>
-                <w:lang w:eastAsia="pl-PL"/>
-                <w14:ligatures w14:val="none"/>
-              </w:rPr>
-              <w:t>NISKI (LOW)</w:t>
-            </w:r>
-          </w:p>
-        </w:tc>
-        <w:tc>
-          <w:tcPr>
-            <w:tcW w:w="0" w:type="auto"/>
-            <w:tcBorders>
-              <w:top w:val="single" w:sz="6" w:space="0" w:color="C4C7C5"/>
-              <w:left w:val="single" w:sz="6" w:space="0" w:color="C4C7C5"/>
-              <w:bottom w:val="single" w:sz="6" w:space="0" w:color="C4C7C5"/>
-              <w:right w:val="single" w:sz="6" w:space="0" w:color="C4C7C5"/>
-            </w:tcBorders>
-            <w:tcMar>
-              <w:top w:w="120" w:type="dxa"/>
-              <w:left w:w="180" w:type="dxa"/>
-              <w:bottom w:w="120" w:type="dxa"/>
-              <w:right w:w="180" w:type="dxa"/>
-            </w:tcMar>
-            <w:vAlign w:val="center"/>
-            <w:hideMark/>
-          </w:tcPr>
-          <w:p>
-            <w:pPr>
-              <w:spacing w:after="0" w:line="240" w:lineRule="auto"/>
-              <w:rPr>
-                <w:rFonts w:eastAsia="Times New Roman" w:cs="Arial"/>
-                <w:kern w:val="0"/>
-                <w:lang w:eastAsia="pl-PL"/>
-                <w14:ligatures w14:val="none"/>
-              </w:rPr>
-            </w:pPr>
-            <w:r>
-              <w:rPr>
-                <w:rFonts w:eastAsia="Times New Roman" w:cs="Arial"/>
-                <w:b/>
-                <w:bCs/>
-                <w:kern w:val="0"/>
-                <w:lang w:eastAsia="pl-PL"/>
-                <w14:ligatures w14:val="none"/>
-              </w:rPr>
-              <w:t>WYSOKI (HIGH)</w:t>
-            </w:r>
-          </w:p>
-        </w:tc>
-        <w:tc>
-          <w:tcPr>
-            <w:tcW w:w="0" w:type="auto"/>
-            <w:tcBorders>
-              <w:top w:val="single" w:sz="6" w:space="0" w:color="C4C7C5"/>
-              <w:left w:val="single" w:sz="6" w:space="0" w:color="C4C7C5"/>
-              <w:bottom w:val="single" w:sz="6" w:space="0" w:color="C4C7C5"/>
-              <w:right w:val="single" w:sz="6" w:space="0" w:color="C4C7C5"/>
-            </w:tcBorders>
-            <w:tcMar>
-              <w:top w:w="120" w:type="dxa"/>
-              <w:left w:w="180" w:type="dxa"/>
-              <w:bottom w:w="120" w:type="dxa"/>
-              <w:right w:w="180" w:type="dxa"/>
-            </w:tcMar>
-            <w:vAlign w:val="center"/>
-            <w:hideMark/>
-          </w:tcPr>
-          <w:p>
-            <w:pPr>
-              <w:spacing w:after="0" w:line="240" w:lineRule="auto"/>
-              <w:rPr>
-                <w:rFonts w:eastAsia="Times New Roman" w:cs="Arial"/>
-                <w:kern w:val="0"/>
-                <w:lang w:eastAsia="pl-PL"/>
-                <w14:ligatures w14:val="none"/>
-              </w:rPr>
-            </w:pPr>
-            <w:r>
-              <w:rPr>
-                <w:rFonts w:eastAsia="Times New Roman" w:cs="Arial"/>
-                <w:b/>
-                <w:bCs/>
-                <w:kern w:val="0"/>
-                <w:lang w:eastAsia="pl-PL"/>
-                <w14:ligatures w14:val="none"/>
-              </w:rPr>
-              <w:t>NISKI (LOW)</w:t>
-            </w:r>
-          </w:p>
-        </w:tc>
-        <w:tc>
-          <w:tcPr>
-            <w:tcW w:w="0" w:type="auto"/>
-            <w:tcBorders>
-              <w:top w:val="single" w:sz="6" w:space="0" w:color="C4C7C5"/>
-              <w:left w:val="single" w:sz="6" w:space="0" w:color="C4C7C5"/>
-              <w:bottom w:val="single" w:sz="6" w:space="0" w:color="C4C7C5"/>
-              <w:right w:val="single" w:sz="6" w:space="0" w:color="C4C7C5"/>
-            </w:tcBorders>
-            <w:tcMar>
-              <w:top w:w="120" w:type="dxa"/>
-              <w:left w:w="180" w:type="dxa"/>
-              <w:bottom w:w="120" w:type="dxa"/>
-              <w:right w:w="180" w:type="dxa"/>
-            </w:tcMar>
-            <w:vAlign w:val="center"/>
-            <w:hideMark/>
-          </w:tcPr>
-          <w:p>
-            <w:pPr>
-              <w:spacing w:after="0" w:line="240" w:lineRule="auto"/>
-              <w:rPr>
-                <w:rFonts w:eastAsia="Times New Roman" w:cs="Arial"/>
-                <w:kern w:val="0"/>
-                <w:lang w:eastAsia="pl-PL"/>
-                <w14:ligatures w14:val="none"/>
-              </w:rPr>
-            </w:pPr>
-            <w:r>
-              <w:rPr>
-                <w:rFonts w:eastAsia="Times New Roman" w:cs="Arial"/>
-                <w:b/>
-                <w:bCs/>
-                <w:kern w:val="0"/>
-                <w:lang w:eastAsia="pl-PL"/>
-                <w14:ligatures w14:val="none"/>
-              </w:rPr>
-              <w:t>ŚREDNI (MEDIUM)</w:t>
-            </w:r>
-          </w:p>
-        </w:tc>
-        <w:tc>
-          <w:tcPr>
-            <w:tcW w:w="0" w:type="auto"/>
-            <w:tcBorders>
-              <w:top w:val="single" w:sz="6" w:space="0" w:color="C4C7C5"/>
-              <w:left w:val="single" w:sz="6" w:space="0" w:color="C4C7C5"/>
-              <w:bottom w:val="single" w:sz="6" w:space="0" w:color="C4C7C5"/>
-              <w:right w:val="single" w:sz="6" w:space="0" w:color="C4C7C5"/>
-            </w:tcBorders>
-            <w:tcMar>
-              <w:top w:w="120" w:type="dxa"/>
-              <w:left w:w="180" w:type="dxa"/>
-              <w:bottom w:w="120" w:type="dxa"/>
-              <w:right w:w="180" w:type="dxa"/>
-            </w:tcMar>
-            <w:vAlign w:val="center"/>
-            <w:hideMark/>
-          </w:tcPr>
-          <w:p>
-            <w:pPr>
-              <w:spacing w:after="0" w:line="240" w:lineRule="auto"/>
-              <w:rPr>
-                <w:rFonts w:eastAsia="Times New Roman" w:cs="Arial"/>
-                <w:kern w:val="0"/>
-                <w:lang w:eastAsia="pl-PL"/>
-                <w14:ligatures w14:val="none"/>
-              </w:rPr>
-            </w:pPr>
-            <w:r>
-              <w:rPr>
-                <w:rFonts w:eastAsia="Times New Roman" w:cs="Arial"/>
-                <w:kern w:val="0"/>
-                <w:lang w:eastAsia="pl-PL"/>
-                <w14:ligatures w14:val="none"/>
-              </w:rPr>
-              <w:t>Front nieustannie faluje, lecz do bezpośrednich starć jednostek prawie nie dochodzi.</w:t>
-            </w:r>
-          </w:p>
-        </w:tc>
-      </w:tr>
-      <w:tr>
-        <w:trPr>
-          <w:tblCellSpacing w:w="15" w:type="dxa"/>
-        </w:trPr>
-        <w:tc>
-          <w:tcPr>
-            <w:tcW w:w="0" w:type="auto"/>
-            <w:tcBorders>
-              <w:top w:val="single" w:sz="6" w:space="0" w:color="C4C7C5"/>
-              <w:left w:val="single" w:sz="6" w:space="0" w:color="C4C7C5"/>
-              <w:bottom w:val="single" w:sz="6" w:space="0" w:color="C4C7C5"/>
-              <w:right w:val="single" w:sz="6" w:space="0" w:color="C4C7C5"/>
-            </w:tcBorders>
-            <w:tcMar>
-              <w:top w:w="120" w:type="dxa"/>
-              <w:left w:w="180" w:type="dxa"/>
-              <w:bottom w:w="120" w:type="dxa"/>
-              <w:right w:w="180" w:type="dxa"/>
-            </w:tcMar>
-            <w:vAlign w:val="center"/>
-            <w:hideMark/>
-          </w:tcPr>
-          <w:p>
-            <w:pPr>
-              <w:spacing w:after="0" w:line="240" w:lineRule="auto"/>
-              <w:rPr>
-                <w:rFonts w:eastAsia="Times New Roman" w:cs="Arial"/>
-                <w:kern w:val="0"/>
-                <w:lang w:eastAsia="pl-PL"/>
-                <w14:ligatures w14:val="none"/>
-              </w:rPr>
-            </w:pPr>
-            <w:r>
-              <w:rPr>
-                <w:rFonts w:eastAsia="Times New Roman" w:cs="Arial"/>
-                <w:b/>
-                <w:bCs/>
-                <w:kern w:val="0"/>
-                <w:lang w:eastAsia="pl-PL"/>
-                <w14:ligatures w14:val="none"/>
-              </w:rPr>
-              <w:t>NISKI (LOW)</w:t>
-            </w:r>
-          </w:p>
-        </w:tc>
-        <w:tc>
-          <w:tcPr>
-            <w:tcW w:w="0" w:type="auto"/>
-            <w:tcBorders>
-              <w:top w:val="single" w:sz="6" w:space="0" w:color="C4C7C5"/>
-              <w:left w:val="single" w:sz="6" w:space="0" w:color="C4C7C5"/>
-              <w:bottom w:val="single" w:sz="6" w:space="0" w:color="C4C7C5"/>
-              <w:right w:val="single" w:sz="6" w:space="0" w:color="C4C7C5"/>
-            </w:tcBorders>
-            <w:tcMar>
-              <w:top w:w="120" w:type="dxa"/>
-              <w:left w:w="180" w:type="dxa"/>
-              <w:bottom w:w="120" w:type="dxa"/>
-              <w:right w:w="180" w:type="dxa"/>
-            </w:tcMar>
-            <w:vAlign w:val="center"/>
-            <w:hideMark/>
-          </w:tcPr>
-          <w:p>
-            <w:pPr>
-              <w:spacing w:after="0" w:line="240" w:lineRule="auto"/>
-              <w:rPr>
-                <w:rFonts w:eastAsia="Times New Roman" w:cs="Arial"/>
-                <w:kern w:val="0"/>
-                <w:lang w:eastAsia="pl-PL"/>
-                <w14:ligatures w14:val="none"/>
-              </w:rPr>
-            </w:pPr>
-            <w:r>
-              <w:rPr>
-                <w:rFonts w:eastAsia="Times New Roman" w:cs="Arial"/>
-                <w:b/>
-                <w:bCs/>
-                <w:kern w:val="0"/>
-                <w:lang w:eastAsia="pl-PL"/>
-                <w14:ligatures w14:val="none"/>
-              </w:rPr>
-              <w:t>WYSOKI (HIGH)</w:t>
-            </w:r>
-          </w:p>
-        </w:tc>
-        <w:tc>
-          <w:tcPr>
-            <w:tcW w:w="0" w:type="auto"/>
-            <w:tcBorders>
-              <w:top w:val="single" w:sz="6" w:space="0" w:color="C4C7C5"/>
-              <w:left w:val="single" w:sz="6" w:space="0" w:color="C4C7C5"/>
-              <w:bottom w:val="single" w:sz="6" w:space="0" w:color="C4C7C5"/>
-              <w:right w:val="single" w:sz="6" w:space="0" w:color="C4C7C5"/>
-            </w:tcBorders>
-            <w:tcMar>
-              <w:top w:w="120" w:type="dxa"/>
-              <w:left w:w="180" w:type="dxa"/>
-              <w:bottom w:w="120" w:type="dxa"/>
-              <w:right w:w="180" w:type="dxa"/>
-            </w:tcMar>
-            <w:vAlign w:val="center"/>
-            <w:hideMark/>
-          </w:tcPr>
-          <w:p>
-            <w:pPr>
-              <w:spacing w:after="0" w:line="240" w:lineRule="auto"/>
-              <w:rPr>
-                <w:rFonts w:eastAsia="Times New Roman" w:cs="Arial"/>
-                <w:kern w:val="0"/>
-                <w:lang w:eastAsia="pl-PL"/>
-                <w14:ligatures w14:val="none"/>
-              </w:rPr>
-            </w:pPr>
-            <w:r>
-              <w:rPr>
-                <w:rFonts w:eastAsia="Times New Roman" w:cs="Arial"/>
-                <w:b/>
-                <w:bCs/>
-                <w:kern w:val="0"/>
-                <w:lang w:eastAsia="pl-PL"/>
-                <w14:ligatures w14:val="none"/>
-              </w:rPr>
-              <w:t>ŚREDNI (MEDIUM)</w:t>
-            </w:r>
-          </w:p>
-        </w:tc>
-        <w:tc>
-          <w:tcPr>
-            <w:tcW w:w="0" w:type="auto"/>
-            <w:tcBorders>
-              <w:top w:val="single" w:sz="6" w:space="0" w:color="C4C7C5"/>
-              <w:left w:val="single" w:sz="6" w:space="0" w:color="C4C7C5"/>
-              <w:bottom w:val="single" w:sz="6" w:space="0" w:color="C4C7C5"/>
-              <w:right w:val="single" w:sz="6" w:space="0" w:color="C4C7C5"/>
-            </w:tcBorders>
-            <w:tcMar>
-              <w:top w:w="120" w:type="dxa"/>
-              <w:left w:w="180" w:type="dxa"/>
-              <w:bottom w:w="120" w:type="dxa"/>
-              <w:right w:w="180" w:type="dxa"/>
-            </w:tcMar>
-            <w:vAlign w:val="center"/>
-            <w:hideMark/>
-          </w:tcPr>
-          <w:p>
-            <w:pPr>
-              <w:spacing w:after="0" w:line="240" w:lineRule="auto"/>
-              <w:rPr>
-                <w:rFonts w:eastAsia="Times New Roman" w:cs="Arial"/>
-                <w:kern w:val="0"/>
-                <w:lang w:eastAsia="pl-PL"/>
-                <w14:ligatures w14:val="none"/>
-              </w:rPr>
-            </w:pPr>
-            <w:r>
-              <w:rPr>
-                <w:rFonts w:eastAsia="Times New Roman" w:cs="Arial"/>
-                <w:b/>
-                <w:bCs/>
-                <w:kern w:val="0"/>
-                <w:lang w:eastAsia="pl-PL"/>
-                <w14:ligatures w14:val="none"/>
-              </w:rPr>
-              <w:t>ŚREDNI (MEDIUM)</w:t>
-            </w:r>
-          </w:p>
-        </w:tc>
-        <w:tc>
-          <w:tcPr>
-            <w:tcW w:w="0" w:type="auto"/>
-            <w:tcBorders>
-              <w:top w:val="single" w:sz="6" w:space="0" w:color="C4C7C5"/>
-              <w:left w:val="single" w:sz="6" w:space="0" w:color="C4C7C5"/>
-              <w:bottom w:val="single" w:sz="6" w:space="0" w:color="C4C7C5"/>
-              <w:right w:val="single" w:sz="6" w:space="0" w:color="C4C7C5"/>
-            </w:tcBorders>
-            <w:tcMar>
-              <w:top w:w="120" w:type="dxa"/>
-              <w:left w:w="180" w:type="dxa"/>
-              <w:bottom w:w="120" w:type="dxa"/>
-              <w:right w:w="180" w:type="dxa"/>
-            </w:tcMar>
-            <w:vAlign w:val="center"/>
-            <w:hideMark/>
-          </w:tcPr>
-          <w:p>
-            <w:pPr>
-              <w:spacing w:after="0" w:line="240" w:lineRule="auto"/>
-              <w:rPr>
-                <w:rFonts w:eastAsia="Times New Roman" w:cs="Arial"/>
-                <w:kern w:val="0"/>
-                <w:lang w:eastAsia="pl-PL"/>
-                <w14:ligatures w14:val="none"/>
-              </w:rPr>
-            </w:pPr>
-            <w:r>
-              <w:rPr>
-                <w:rFonts w:eastAsia="Times New Roman" w:cs="Arial"/>
-                <w:kern w:val="0"/>
-                <w:lang w:eastAsia="pl-PL"/>
-                <w14:ligatures w14:val="none"/>
-              </w:rPr>
-              <w:t>Intensywna wymiana terytorium przy umiarkowanym wychyleniu przewagi.</w:t>
-            </w:r>
-          </w:p>
-        </w:tc>
-      </w:tr>
-      <w:tr>
-        <w:trPr>
-          <w:tblCellSpacing w:w="15" w:type="dxa"/>
-        </w:trPr>
-        <w:tc>
-          <w:tcPr>
-            <w:tcW w:w="0" w:type="auto"/>
-            <w:tcBorders>
-              <w:top w:val="single" w:sz="6" w:space="0" w:color="C4C7C5"/>
-              <w:left w:val="single" w:sz="6" w:space="0" w:color="C4C7C5"/>
-              <w:bottom w:val="single" w:sz="6" w:space="0" w:color="C4C7C5"/>
-              <w:right w:val="single" w:sz="6" w:space="0" w:color="C4C7C5"/>
-            </w:tcBorders>
-            <w:tcMar>
-              <w:top w:w="120" w:type="dxa"/>
-              <w:left w:w="180" w:type="dxa"/>
-              <w:bottom w:w="120" w:type="dxa"/>
-              <w:right w:w="180" w:type="dxa"/>
-            </w:tcMar>
-            <w:vAlign w:val="center"/>
-            <w:hideMark/>
-          </w:tcPr>
-          <w:p>
-            <w:pPr>
-              <w:spacing w:after="0" w:line="240" w:lineRule="auto"/>
-              <w:rPr>
-                <w:rFonts w:eastAsia="Times New Roman" w:cs="Arial"/>
-                <w:kern w:val="0"/>
-                <w:lang w:eastAsia="pl-PL"/>
-                <w14:ligatures w14:val="none"/>
-              </w:rPr>
-            </w:pPr>
-            <w:r>
-              <w:rPr>
-                <w:rFonts w:eastAsia="Times New Roman" w:cs="Arial"/>
-                <w:b/>
-                <w:bCs/>
-                <w:kern w:val="0"/>
-                <w:lang w:eastAsia="pl-PL"/>
-                <w14:ligatures w14:val="none"/>
-              </w:rPr>
-              <w:t>NISKI (LOW)</w:t>
-            </w:r>
-          </w:p>
-        </w:tc>
-        <w:tc>
-          <w:tcPr>
-            <w:tcW w:w="0" w:type="auto"/>
-            <w:tcBorders>
-              <w:top w:val="single" w:sz="6" w:space="0" w:color="C4C7C5"/>
-              <w:left w:val="single" w:sz="6" w:space="0" w:color="C4C7C5"/>
-              <w:bottom w:val="single" w:sz="6" w:space="0" w:color="C4C7C5"/>
-              <w:right w:val="single" w:sz="6" w:space="0" w:color="C4C7C5"/>
-            </w:tcBorders>
-            <w:tcMar>
-              <w:top w:w="120" w:type="dxa"/>
-              <w:left w:w="180" w:type="dxa"/>
-              <w:bottom w:w="120" w:type="dxa"/>
-              <w:right w:w="180" w:type="dxa"/>
-            </w:tcMar>
-            <w:vAlign w:val="center"/>
-            <w:hideMark/>
-          </w:tcPr>
-          <w:p>
-            <w:pPr>
-              <w:spacing w:after="0" w:line="240" w:lineRule="auto"/>
-              <w:rPr>
-                <w:rFonts w:eastAsia="Times New Roman" w:cs="Arial"/>
-                <w:kern w:val="0"/>
-                <w:lang w:eastAsia="pl-PL"/>
-                <w14:ligatures w14:val="none"/>
-              </w:rPr>
-            </w:pPr>
-            <w:r>
-              <w:rPr>
-                <w:rFonts w:eastAsia="Times New Roman" w:cs="Arial"/>
-                <w:b/>
-                <w:bCs/>
-                <w:kern w:val="0"/>
-                <w:lang w:eastAsia="pl-PL"/>
-                <w14:ligatures w14:val="none"/>
-              </w:rPr>
-              <w:t>WYSOKI (HIGH)</w:t>
-            </w:r>
-          </w:p>
-        </w:tc>
-        <w:tc>
-          <w:tcPr>
-            <w:tcW w:w="0" w:type="auto"/>
-            <w:tcBorders>
-              <w:top w:val="single" w:sz="6" w:space="0" w:color="C4C7C5"/>
-              <w:left w:val="single" w:sz="6" w:space="0" w:color="C4C7C5"/>
-              <w:bottom w:val="single" w:sz="6" w:space="0" w:color="C4C7C5"/>
-              <w:right w:val="single" w:sz="6" w:space="0" w:color="C4C7C5"/>
-            </w:tcBorders>
-            <w:tcMar>
-              <w:top w:w="120" w:type="dxa"/>
-              <w:left w:w="180" w:type="dxa"/>
-              <w:bottom w:w="120" w:type="dxa"/>
-              <w:right w:w="180" w:type="dxa"/>
-            </w:tcMar>
-            <w:vAlign w:val="center"/>
-            <w:hideMark/>
-          </w:tcPr>
-          <w:p>
-            <w:pPr>
-              <w:spacing w:after="0" w:line="240" w:lineRule="auto"/>
-              <w:rPr>
-                <w:rFonts w:eastAsia="Times New Roman" w:cs="Arial"/>
-                <w:kern w:val="0"/>
-                <w:lang w:eastAsia="pl-PL"/>
-                <w14:ligatures w14:val="none"/>
-              </w:rPr>
-            </w:pPr>
-            <w:r>
-              <w:rPr>
-                <w:rFonts w:eastAsia="Times New Roman" w:cs="Arial"/>
-                <w:b/>
-                <w:bCs/>
-                <w:kern w:val="0"/>
-                <w:lang w:eastAsia="pl-PL"/>
-                <w14:ligatures w14:val="none"/>
-              </w:rPr>
-              <w:t>WYSOKI (HIGH)</w:t>
-            </w:r>
-          </w:p>
-        </w:tc>
-        <w:tc>
-          <w:tcPr>
-            <w:tcW w:w="0" w:type="auto"/>
-            <w:tcBorders>
-              <w:top w:val="single" w:sz="6" w:space="0" w:color="C4C7C5"/>
-              <w:left w:val="single" w:sz="6" w:space="0" w:color="C4C7C5"/>
-              <w:bottom w:val="single" w:sz="6" w:space="0" w:color="C4C7C5"/>
-              <w:right w:val="single" w:sz="6" w:space="0" w:color="C4C7C5"/>
-            </w:tcBorders>
-            <w:tcMar>
-              <w:top w:w="120" w:type="dxa"/>
-              <w:left w:w="180" w:type="dxa"/>
-              <w:bottom w:w="120" w:type="dxa"/>
-              <w:right w:w="180" w:type="dxa"/>
-            </w:tcMar>
-            <w:vAlign w:val="center"/>
-            <w:hideMark/>
-          </w:tcPr>
-          <w:p>
-            <w:pPr>
-              <w:spacing w:after="0" w:line="240" w:lineRule="auto"/>
-              <w:rPr>
-                <w:rFonts w:eastAsia="Times New Roman" w:cs="Arial"/>
-                <w:kern w:val="0"/>
-                <w:lang w:eastAsia="pl-PL"/>
-                <w14:ligatures w14:val="none"/>
-              </w:rPr>
-            </w:pPr>
-            <w:r>
-              <w:rPr>
-                <w:rFonts w:eastAsia="Times New Roman" w:cs="Arial"/>
-                <w:b/>
-                <w:bCs/>
-                <w:kern w:val="0"/>
-                <w:lang w:eastAsia="pl-PL"/>
-                <w14:ligatures w14:val="none"/>
-              </w:rPr>
-              <w:t>ŚREDNI (MEDIUM)</w:t>
-            </w:r>
-          </w:p>
-        </w:tc>
-        <w:tc>
-          <w:tcPr>
-            <w:tcW w:w="0" w:type="auto"/>
-            <w:tcBorders>
-              <w:top w:val="single" w:sz="6" w:space="0" w:color="C4C7C5"/>
-              <w:left w:val="single" w:sz="6" w:space="0" w:color="C4C7C5"/>
-              <w:bottom w:val="single" w:sz="6" w:space="0" w:color="C4C7C5"/>
-              <w:right w:val="single" w:sz="6" w:space="0" w:color="C4C7C5"/>
-            </w:tcBorders>
-            <w:tcMar>
-              <w:top w:w="120" w:type="dxa"/>
-              <w:left w:w="180" w:type="dxa"/>
-              <w:bottom w:w="120" w:type="dxa"/>
-              <w:right w:w="180" w:type="dxa"/>
-            </w:tcMar>
-            <w:vAlign w:val="center"/>
-            <w:hideMark/>
-          </w:tcPr>
-          <w:p>
-            <w:pPr>
-              <w:spacing w:after="0" w:line="240" w:lineRule="auto"/>
-              <w:rPr>
-                <w:rFonts w:eastAsia="Times New Roman" w:cs="Arial"/>
-                <w:kern w:val="0"/>
-                <w:lang w:eastAsia="pl-PL"/>
-                <w14:ligatures w14:val="none"/>
-              </w:rPr>
-            </w:pPr>
-            <w:r>
-              <w:rPr>
-                <w:rFonts w:eastAsia="Times New Roman" w:cs="Arial"/>
-                <w:kern w:val="0"/>
-                <w:lang w:eastAsia="pl-PL"/>
-                <w14:ligatures w14:val="none"/>
-              </w:rPr>
-              <w:t>Duża wymiana pól, zakończona jednak jednostronną dominacją jednej ze stron.</w:t>
-            </w:r>
-          </w:p>
-        </w:tc>
-      </w:tr>
-      <w:tr>
-        <w:trPr>
-          <w:tblCellSpacing w:w="15" w:type="dxa"/>
-        </w:trPr>
-        <w:tc>
-          <w:tcPr>
-            <w:tcW w:w="0" w:type="auto"/>
-            <w:tcBorders>
-              <w:top w:val="single" w:sz="6" w:space="0" w:color="C4C7C5"/>
-              <w:left w:val="single" w:sz="6" w:space="0" w:color="C4C7C5"/>
-              <w:bottom w:val="single" w:sz="6" w:space="0" w:color="C4C7C5"/>
-              <w:right w:val="single" w:sz="6" w:space="0" w:color="C4C7C5"/>
-            </w:tcBorders>
-            <w:tcMar>
-              <w:top w:w="120" w:type="dxa"/>
-              <w:left w:w="180" w:type="dxa"/>
-              <w:bottom w:w="120" w:type="dxa"/>
-              <w:right w:w="180" w:type="dxa"/>
-            </w:tcMar>
-            <w:vAlign w:val="center"/>
-            <w:hideMark/>
-          </w:tcPr>
-          <w:p>
-            <w:pPr>
-              <w:spacing w:after="0" w:line="240" w:lineRule="auto"/>
-              <w:rPr>
-                <w:rFonts w:eastAsia="Times New Roman" w:cs="Arial"/>
-                <w:kern w:val="0"/>
-                <w:lang w:eastAsia="pl-PL"/>
-                <w14:ligatures w14:val="none"/>
-              </w:rPr>
-            </w:pPr>
-            <w:r>
-              <w:rPr>
-                <w:rFonts w:eastAsia="Times New Roman" w:cs="Arial"/>
-                <w:b/>
-                <w:bCs/>
-                <w:kern w:val="0"/>
-                <w:lang w:eastAsia="pl-PL"/>
-                <w14:ligatures w14:val="none"/>
-              </w:rPr>
-              <w:t>WYSOKI (HIGH)</w:t>
-            </w:r>
-          </w:p>
-        </w:tc>
-        <w:tc>
-          <w:tcPr>
-            <w:tcW w:w="0" w:type="auto"/>
-            <w:tcBorders>
-              <w:top w:val="single" w:sz="6" w:space="0" w:color="C4C7C5"/>
-              <w:left w:val="single" w:sz="6" w:space="0" w:color="C4C7C5"/>
-              <w:bottom w:val="single" w:sz="6" w:space="0" w:color="C4C7C5"/>
-              <w:right w:val="single" w:sz="6" w:space="0" w:color="C4C7C5"/>
-            </w:tcBorders>
-            <w:tcMar>
-              <w:top w:w="120" w:type="dxa"/>
-              <w:left w:w="180" w:type="dxa"/>
-              <w:bottom w:w="120" w:type="dxa"/>
-              <w:right w:w="180" w:type="dxa"/>
-            </w:tcMar>
-            <w:vAlign w:val="center"/>
-            <w:hideMark/>
-          </w:tcPr>
-          <w:p>
-            <w:pPr>
-              <w:spacing w:after="0" w:line="240" w:lineRule="auto"/>
-              <w:rPr>
-                <w:rFonts w:eastAsia="Times New Roman" w:cs="Arial"/>
-                <w:kern w:val="0"/>
-                <w:lang w:eastAsia="pl-PL"/>
-                <w14:ligatures w14:val="none"/>
-              </w:rPr>
-            </w:pPr>
-            <w:r>
-              <w:rPr>
-                <w:rFonts w:eastAsia="Times New Roman" w:cs="Arial"/>
-                <w:b/>
-                <w:bCs/>
-                <w:kern w:val="0"/>
-                <w:lang w:eastAsia="pl-PL"/>
-                <w14:ligatures w14:val="none"/>
-              </w:rPr>
-              <w:t>NISKI (LOW)</w:t>
-            </w:r>
-          </w:p>
-        </w:tc>
-        <w:tc>
-          <w:tcPr>
-            <w:tcW w:w="0" w:type="auto"/>
-            <w:tcBorders>
-              <w:top w:val="single" w:sz="6" w:space="0" w:color="C4C7C5"/>
-              <w:left w:val="single" w:sz="6" w:space="0" w:color="C4C7C5"/>
-              <w:bottom w:val="single" w:sz="6" w:space="0" w:color="C4C7C5"/>
-              <w:right w:val="single" w:sz="6" w:space="0" w:color="C4C7C5"/>
-            </w:tcBorders>
-            <w:tcMar>
-              <w:top w:w="120" w:type="dxa"/>
-              <w:left w:w="180" w:type="dxa"/>
-              <w:bottom w:w="120" w:type="dxa"/>
-              <w:right w:w="180" w:type="dxa"/>
-            </w:tcMar>
-            <w:vAlign w:val="center"/>
-            <w:hideMark/>
-          </w:tcPr>
-          <w:p>
-            <w:pPr>
-              <w:spacing w:after="0" w:line="240" w:lineRule="auto"/>
-              <w:rPr>
-                <w:rFonts w:eastAsia="Times New Roman" w:cs="Arial"/>
-                <w:kern w:val="0"/>
-                <w:lang w:eastAsia="pl-PL"/>
-                <w14:ligatures w14:val="none"/>
-              </w:rPr>
-            </w:pPr>
-            <w:r>
-              <w:rPr>
-                <w:rFonts w:eastAsia="Times New Roman" w:cs="Arial"/>
-                <w:b/>
-                <w:bCs/>
-                <w:kern w:val="0"/>
-                <w:lang w:eastAsia="pl-PL"/>
-                <w14:ligatures w14:val="none"/>
-              </w:rPr>
-              <w:t>NISKI (LOW)</w:t>
-            </w:r>
-          </w:p>
-        </w:tc>
-        <w:tc>
-          <w:tcPr>
-            <w:tcW w:w="0" w:type="auto"/>
-            <w:tcBorders>
-              <w:top w:val="single" w:sz="6" w:space="0" w:color="C4C7C5"/>
-              <w:left w:val="single" w:sz="6" w:space="0" w:color="C4C7C5"/>
-              <w:bottom w:val="single" w:sz="6" w:space="0" w:color="C4C7C5"/>
-              <w:right w:val="single" w:sz="6" w:space="0" w:color="C4C7C5"/>
-            </w:tcBorders>
-            <w:tcMar>
-              <w:top w:w="120" w:type="dxa"/>
-              <w:left w:w="180" w:type="dxa"/>
-              <w:bottom w:w="120" w:type="dxa"/>
-              <w:right w:w="180" w:type="dxa"/>
-            </w:tcMar>
-            <w:vAlign w:val="center"/>
-            <w:hideMark/>
-          </w:tcPr>
-          <w:p>
-            <w:pPr>
-              <w:spacing w:after="0" w:line="240" w:lineRule="auto"/>
-              <w:rPr>
-                <w:rFonts w:eastAsia="Times New Roman" w:cs="Arial"/>
-                <w:kern w:val="0"/>
-                <w:lang w:eastAsia="pl-PL"/>
-                <w14:ligatures w14:val="none"/>
-              </w:rPr>
-            </w:pPr>
-            <w:r>
-              <w:rPr>
-                <w:rFonts w:eastAsia="Times New Roman" w:cs="Arial"/>
-                <w:b/>
-                <w:bCs/>
-                <w:kern w:val="0"/>
-                <w:lang w:eastAsia="pl-PL"/>
-                <w14:ligatures w14:val="none"/>
-              </w:rPr>
-              <w:t>ŚREDNI (MEDIUM)</w:t>
-            </w:r>
-          </w:p>
-        </w:tc>
-        <w:tc>
-          <w:tcPr>
-            <w:tcW w:w="0" w:type="auto"/>
-            <w:tcBorders>
-              <w:top w:val="single" w:sz="6" w:space="0" w:color="C4C7C5"/>
-              <w:left w:val="single" w:sz="6" w:space="0" w:color="C4C7C5"/>
-              <w:bottom w:val="single" w:sz="6" w:space="0" w:color="C4C7C5"/>
-              <w:right w:val="single" w:sz="6" w:space="0" w:color="C4C7C5"/>
-            </w:tcBorders>
-            <w:tcMar>
-              <w:top w:w="120" w:type="dxa"/>
-              <w:left w:w="180" w:type="dxa"/>
-              <w:bottom w:w="120" w:type="dxa"/>
-              <w:right w:w="180" w:type="dxa"/>
-            </w:tcMar>
-            <w:vAlign w:val="center"/>
-            <w:hideMark/>
-          </w:tcPr>
-          <w:p>
-            <w:pPr>
-              <w:spacing w:after="0" w:line="240" w:lineRule="auto"/>
-              <w:rPr>
-                <w:rFonts w:eastAsia="Times New Roman" w:cs="Arial"/>
-                <w:kern w:val="0"/>
-                <w:lang w:eastAsia="pl-PL"/>
-                <w14:ligatures w14:val="none"/>
-              </w:rPr>
-            </w:pPr>
-            <w:r>
-              <w:rPr>
-                <w:rFonts w:eastAsia="Times New Roman" w:cs="Arial"/>
-                <w:kern w:val="0"/>
-                <w:lang w:eastAsia="pl-PL"/>
-                <w14:ligatures w14:val="none"/>
-              </w:rPr>
-              <w:t>Armie ścierają się często, ale front pozostaje w miejscu. Klasyczna wojna pozycyjna.</w:t>
-            </w:r>
-          </w:p>
-        </w:tc>
-      </w:tr>
-      <w:tr>
-        <w:trPr>
-          <w:tblCellSpacing w:w="15" w:type="dxa"/>
-        </w:trPr>
-        <w:tc>
-          <w:tcPr>
-            <w:tcW w:w="0" w:type="auto"/>
-            <w:tcBorders>
-              <w:top w:val="single" w:sz="6" w:space="0" w:color="C4C7C5"/>
-              <w:left w:val="single" w:sz="6" w:space="0" w:color="C4C7C5"/>
-              <w:bottom w:val="single" w:sz="6" w:space="0" w:color="C4C7C5"/>
-              <w:right w:val="single" w:sz="6" w:space="0" w:color="C4C7C5"/>
-            </w:tcBorders>
-            <w:tcMar>
-              <w:top w:w="120" w:type="dxa"/>
-              <w:left w:w="180" w:type="dxa"/>
-              <w:bottom w:w="120" w:type="dxa"/>
-              <w:right w:w="180" w:type="dxa"/>
-            </w:tcMar>
-            <w:vAlign w:val="center"/>
-            <w:hideMark/>
-          </w:tcPr>
-          <w:p>
-            <w:pPr>
-              <w:spacing w:after="0" w:line="240" w:lineRule="auto"/>
-              <w:rPr>
-                <w:rFonts w:eastAsia="Times New Roman" w:cs="Arial"/>
-                <w:kern w:val="0"/>
-                <w:lang w:eastAsia="pl-PL"/>
-                <w14:ligatures w14:val="none"/>
-              </w:rPr>
-            </w:pPr>
-            <w:r>
-              <w:rPr>
-                <w:rFonts w:eastAsia="Times New Roman" w:cs="Arial"/>
-                <w:b/>
-                <w:bCs/>
-                <w:kern w:val="0"/>
-                <w:lang w:eastAsia="pl-PL"/>
-                <w14:ligatures w14:val="none"/>
-              </w:rPr>
-              <w:lastRenderedPageBreak/>
-              <w:t>WYSOKI (HIGH)</w:t>
-            </w:r>
-          </w:p>
-        </w:tc>
-        <w:tc>
-          <w:tcPr>
-            <w:tcW w:w="0" w:type="auto"/>
-            <w:tcBorders>
-              <w:top w:val="single" w:sz="6" w:space="0" w:color="C4C7C5"/>
-              <w:left w:val="single" w:sz="6" w:space="0" w:color="C4C7C5"/>
-              <w:bottom w:val="single" w:sz="6" w:space="0" w:color="C4C7C5"/>
-              <w:right w:val="single" w:sz="6" w:space="0" w:color="C4C7C5"/>
-            </w:tcBorders>
-            <w:tcMar>
-              <w:top w:w="120" w:type="dxa"/>
-              <w:left w:w="180" w:type="dxa"/>
-              <w:bottom w:w="120" w:type="dxa"/>
-              <w:right w:w="180" w:type="dxa"/>
-            </w:tcMar>
-            <w:vAlign w:val="center"/>
-            <w:hideMark/>
-          </w:tcPr>
-          <w:p>
-            <w:pPr>
-              <w:spacing w:after="0" w:line="240" w:lineRule="auto"/>
-              <w:rPr>
-                <w:rFonts w:eastAsia="Times New Roman" w:cs="Arial"/>
-                <w:kern w:val="0"/>
-                <w:lang w:eastAsia="pl-PL"/>
-                <w14:ligatures w14:val="none"/>
-              </w:rPr>
-            </w:pPr>
-            <w:r>
-              <w:rPr>
-                <w:rFonts w:eastAsia="Times New Roman" w:cs="Arial"/>
-                <w:b/>
-                <w:bCs/>
-                <w:kern w:val="0"/>
-                <w:lang w:eastAsia="pl-PL"/>
-                <w14:ligatures w14:val="none"/>
-              </w:rPr>
-              <w:t>NISKI (LOW)</w:t>
-            </w:r>
-          </w:p>
-        </w:tc>
-        <w:tc>
-          <w:tcPr>
-            <w:tcW w:w="0" w:type="auto"/>
-            <w:tcBorders>
-              <w:top w:val="single" w:sz="6" w:space="0" w:color="C4C7C5"/>
-              <w:left w:val="single" w:sz="6" w:space="0" w:color="C4C7C5"/>
-              <w:bottom w:val="single" w:sz="6" w:space="0" w:color="C4C7C5"/>
-              <w:right w:val="single" w:sz="6" w:space="0" w:color="C4C7C5"/>
-            </w:tcBorders>
-            <w:tcMar>
-              <w:top w:w="120" w:type="dxa"/>
-              <w:left w:w="180" w:type="dxa"/>
-              <w:bottom w:w="120" w:type="dxa"/>
-              <w:right w:w="180" w:type="dxa"/>
-            </w:tcMar>
-            <w:vAlign w:val="center"/>
-            <w:hideMark/>
-          </w:tcPr>
-          <w:p>
-            <w:pPr>
-              <w:spacing w:after="0" w:line="240" w:lineRule="auto"/>
-              <w:rPr>
-                <w:rFonts w:eastAsia="Times New Roman" w:cs="Arial"/>
-                <w:kern w:val="0"/>
-                <w:lang w:eastAsia="pl-PL"/>
-                <w14:ligatures w14:val="none"/>
-              </w:rPr>
-            </w:pPr>
-            <w:r>
-              <w:rPr>
-                <w:rFonts w:eastAsia="Times New Roman" w:cs="Arial"/>
-                <w:b/>
-                <w:bCs/>
-                <w:kern w:val="0"/>
-                <w:lang w:eastAsia="pl-PL"/>
-                <w14:ligatures w14:val="none"/>
-              </w:rPr>
-              <w:t>ŚREDNI (MEDIUM)</w:t>
-            </w:r>
-          </w:p>
-        </w:tc>
-        <w:tc>
-          <w:tcPr>
-            <w:tcW w:w="0" w:type="auto"/>
-            <w:tcBorders>
-              <w:top w:val="single" w:sz="6" w:space="0" w:color="C4C7C5"/>
-              <w:left w:val="single" w:sz="6" w:space="0" w:color="C4C7C5"/>
-              <w:bottom w:val="single" w:sz="6" w:space="0" w:color="C4C7C5"/>
-              <w:right w:val="single" w:sz="6" w:space="0" w:color="C4C7C5"/>
-            </w:tcBorders>
-            <w:tcMar>
-              <w:top w:w="120" w:type="dxa"/>
-              <w:left w:w="180" w:type="dxa"/>
-              <w:bottom w:w="120" w:type="dxa"/>
-              <w:right w:w="180" w:type="dxa"/>
-            </w:tcMar>
-            <w:vAlign w:val="center"/>
-            <w:hideMark/>
-          </w:tcPr>
-          <w:p>
-            <w:pPr>
-              <w:spacing w:after="0" w:line="240" w:lineRule="auto"/>
-              <w:rPr>
-                <w:rFonts w:eastAsia="Times New Roman" w:cs="Arial"/>
-                <w:kern w:val="0"/>
-                <w:lang w:eastAsia="pl-PL"/>
-                <w14:ligatures w14:val="none"/>
-              </w:rPr>
-            </w:pPr>
-            <w:r>
-              <w:rPr>
-                <w:rFonts w:eastAsia="Times New Roman" w:cs="Arial"/>
-                <w:b/>
-                <w:bCs/>
-                <w:kern w:val="0"/>
-                <w:lang w:eastAsia="pl-PL"/>
-                <w14:ligatures w14:val="none"/>
-              </w:rPr>
-              <w:t>ŚREDNI (MEDIUM)</w:t>
-            </w:r>
-          </w:p>
-        </w:tc>
-        <w:tc>
-          <w:tcPr>
-            <w:tcW w:w="0" w:type="auto"/>
-            <w:tcBorders>
-              <w:top w:val="single" w:sz="6" w:space="0" w:color="C4C7C5"/>
-              <w:left w:val="single" w:sz="6" w:space="0" w:color="C4C7C5"/>
-              <w:bottom w:val="single" w:sz="6" w:space="0" w:color="C4C7C5"/>
-              <w:right w:val="single" w:sz="6" w:space="0" w:color="C4C7C5"/>
-            </w:tcBorders>
-            <w:tcMar>
-              <w:top w:w="120" w:type="dxa"/>
-              <w:left w:w="180" w:type="dxa"/>
-              <w:bottom w:w="120" w:type="dxa"/>
-              <w:right w:w="180" w:type="dxa"/>
-            </w:tcMar>
-            <w:vAlign w:val="center"/>
-            <w:hideMark/>
-          </w:tcPr>
-          <w:p>
-            <w:pPr>
-              <w:spacing w:after="0" w:line="240" w:lineRule="auto"/>
-              <w:rPr>
-                <w:rFonts w:eastAsia="Times New Roman" w:cs="Arial"/>
-                <w:kern w:val="0"/>
-                <w:lang w:eastAsia="pl-PL"/>
-                <w14:ligatures w14:val="none"/>
-              </w:rPr>
-            </w:pPr>
-            <w:r>
-              <w:rPr>
-                <w:rFonts w:eastAsia="Times New Roman" w:cs="Arial"/>
-                <w:kern w:val="0"/>
-                <w:lang w:eastAsia="pl-PL"/>
-                <w14:ligatures w14:val="none"/>
-              </w:rPr>
-              <w:t>Częste starcia i wyraźne wychylenie przewagi przy nieruchomej linii frontu.</w:t>
-            </w:r>
-          </w:p>
-        </w:tc>
-      </w:tr>
-      <w:tr>
-        <w:trPr>
-          <w:tblCellSpacing w:w="15" w:type="dxa"/>
-        </w:trPr>
-        <w:tc>
-          <w:tcPr>
-            <w:tcW w:w="0" w:type="auto"/>
-            <w:tcBorders>
-              <w:top w:val="single" w:sz="6" w:space="0" w:color="C4C7C5"/>
-              <w:left w:val="single" w:sz="6" w:space="0" w:color="C4C7C5"/>
-              <w:bottom w:val="single" w:sz="6" w:space="0" w:color="C4C7C5"/>
-              <w:right w:val="single" w:sz="6" w:space="0" w:color="C4C7C5"/>
-            </w:tcBorders>
-            <w:tcMar>
-              <w:top w:w="120" w:type="dxa"/>
-              <w:left w:w="180" w:type="dxa"/>
-              <w:bottom w:w="120" w:type="dxa"/>
-              <w:right w:w="180" w:type="dxa"/>
-            </w:tcMar>
-            <w:vAlign w:val="center"/>
-            <w:hideMark/>
-          </w:tcPr>
-          <w:p>
-            <w:pPr>
-              <w:spacing w:after="0" w:line="240" w:lineRule="auto"/>
-              <w:rPr>
-                <w:rFonts w:eastAsia="Times New Roman" w:cs="Arial"/>
-                <w:kern w:val="0"/>
-                <w:lang w:eastAsia="pl-PL"/>
-                <w14:ligatures w14:val="none"/>
-              </w:rPr>
-            </w:pPr>
-            <w:r>
-              <w:rPr>
-                <w:rFonts w:eastAsia="Times New Roman" w:cs="Arial"/>
-                <w:b/>
-                <w:bCs/>
-                <w:kern w:val="0"/>
-                <w:lang w:eastAsia="pl-PL"/>
-                <w14:ligatures w14:val="none"/>
-              </w:rPr>
-              <w:t>WYSOKI (HIGH)</w:t>
-            </w:r>
-          </w:p>
-        </w:tc>
-        <w:tc>
-          <w:tcPr>
-            <w:tcW w:w="0" w:type="auto"/>
-            <w:tcBorders>
-              <w:top w:val="single" w:sz="6" w:space="0" w:color="C4C7C5"/>
-              <w:left w:val="single" w:sz="6" w:space="0" w:color="C4C7C5"/>
-              <w:bottom w:val="single" w:sz="6" w:space="0" w:color="C4C7C5"/>
-              <w:right w:val="single" w:sz="6" w:space="0" w:color="C4C7C5"/>
-            </w:tcBorders>
-            <w:tcMar>
-              <w:top w:w="120" w:type="dxa"/>
-              <w:left w:w="180" w:type="dxa"/>
-              <w:bottom w:w="120" w:type="dxa"/>
-              <w:right w:w="180" w:type="dxa"/>
-            </w:tcMar>
-            <w:vAlign w:val="center"/>
-            <w:hideMark/>
-          </w:tcPr>
-          <w:p>
-            <w:pPr>
-              <w:spacing w:after="0" w:line="240" w:lineRule="auto"/>
-              <w:rPr>
-                <w:rFonts w:eastAsia="Times New Roman" w:cs="Arial"/>
-                <w:kern w:val="0"/>
-                <w:lang w:eastAsia="pl-PL"/>
-                <w14:ligatures w14:val="none"/>
-              </w:rPr>
-            </w:pPr>
-            <w:r>
-              <w:rPr>
-                <w:rFonts w:eastAsia="Times New Roman" w:cs="Arial"/>
-                <w:b/>
-                <w:bCs/>
-                <w:kern w:val="0"/>
-                <w:lang w:eastAsia="pl-PL"/>
-                <w14:ligatures w14:val="none"/>
-              </w:rPr>
-              <w:t>NISKI (LOW)</w:t>
-            </w:r>
-          </w:p>
-        </w:tc>
-        <w:tc>
-          <w:tcPr>
-            <w:tcW w:w="0" w:type="auto"/>
-            <w:tcBorders>
-              <w:top w:val="single" w:sz="6" w:space="0" w:color="C4C7C5"/>
-              <w:left w:val="single" w:sz="6" w:space="0" w:color="C4C7C5"/>
-              <w:bottom w:val="single" w:sz="6" w:space="0" w:color="C4C7C5"/>
-              <w:right w:val="single" w:sz="6" w:space="0" w:color="C4C7C5"/>
-            </w:tcBorders>
-            <w:tcMar>
-              <w:top w:w="120" w:type="dxa"/>
-              <w:left w:w="180" w:type="dxa"/>
-              <w:bottom w:w="120" w:type="dxa"/>
-              <w:right w:w="180" w:type="dxa"/>
-            </w:tcMar>
-            <w:vAlign w:val="center"/>
-            <w:hideMark/>
-          </w:tcPr>
-          <w:p>
-            <w:pPr>
-              <w:spacing w:after="0" w:line="240" w:lineRule="auto"/>
-              <w:rPr>
-                <w:rFonts w:eastAsia="Times New Roman" w:cs="Arial"/>
-                <w:kern w:val="0"/>
-                <w:lang w:eastAsia="pl-PL"/>
-                <w14:ligatures w14:val="none"/>
-              </w:rPr>
-            </w:pPr>
-            <w:r>
-              <w:rPr>
-                <w:rFonts w:eastAsia="Times New Roman" w:cs="Arial"/>
-                <w:b/>
-                <w:bCs/>
-                <w:kern w:val="0"/>
-                <w:lang w:eastAsia="pl-PL"/>
-                <w14:ligatures w14:val="none"/>
-              </w:rPr>
-              <w:t>WYSOKI (HIGH)</w:t>
-            </w:r>
-          </w:p>
-        </w:tc>
-        <w:tc>
-          <w:tcPr>
-            <w:tcW w:w="0" w:type="auto"/>
-            <w:tcBorders>
-              <w:top w:val="single" w:sz="6" w:space="0" w:color="C4C7C5"/>
-              <w:left w:val="single" w:sz="6" w:space="0" w:color="C4C7C5"/>
-              <w:bottom w:val="single" w:sz="6" w:space="0" w:color="C4C7C5"/>
-              <w:right w:val="single" w:sz="6" w:space="0" w:color="C4C7C5"/>
-            </w:tcBorders>
-            <w:tcMar>
-              <w:top w:w="120" w:type="dxa"/>
-              <w:left w:w="180" w:type="dxa"/>
-              <w:bottom w:w="120" w:type="dxa"/>
-              <w:right w:w="180" w:type="dxa"/>
-            </w:tcMar>
-            <w:vAlign w:val="center"/>
-            <w:hideMark/>
-          </w:tcPr>
-          <w:p>
-            <w:pPr>
-              <w:spacing w:after="0" w:line="240" w:lineRule="auto"/>
-              <w:rPr>
-                <w:rFonts w:eastAsia="Times New Roman" w:cs="Arial"/>
-                <w:kern w:val="0"/>
-                <w:lang w:eastAsia="pl-PL"/>
-                <w14:ligatures w14:val="none"/>
-              </w:rPr>
-            </w:pPr>
-            <w:r>
-              <w:rPr>
-                <w:rFonts w:eastAsia="Times New Roman" w:cs="Arial"/>
-                <w:b/>
-                <w:bCs/>
-                <w:kern w:val="0"/>
-                <w:lang w:eastAsia="pl-PL"/>
-                <w14:ligatures w14:val="none"/>
-              </w:rPr>
-              <w:t>ŚREDNI (MEDIUM)</w:t>
-            </w:r>
-          </w:p>
-        </w:tc>
-        <w:tc>
-          <w:tcPr>
-            <w:tcW w:w="0" w:type="auto"/>
-            <w:tcBorders>
-              <w:top w:val="single" w:sz="6" w:space="0" w:color="C4C7C5"/>
-              <w:left w:val="single" w:sz="6" w:space="0" w:color="C4C7C5"/>
-              <w:bottom w:val="single" w:sz="6" w:space="0" w:color="C4C7C5"/>
-              <w:right w:val="single" w:sz="6" w:space="0" w:color="C4C7C5"/>
-            </w:tcBorders>
-            <w:tcMar>
-              <w:top w:w="120" w:type="dxa"/>
-              <w:left w:w="180" w:type="dxa"/>
-              <w:bottom w:w="120" w:type="dxa"/>
-              <w:right w:w="180" w:type="dxa"/>
-            </w:tcMar>
-            <w:vAlign w:val="center"/>
-            <w:hideMark/>
-          </w:tcPr>
-          <w:p>
-            <w:pPr>
-              <w:spacing w:after="0" w:line="240" w:lineRule="auto"/>
-              <w:rPr>
-                <w:rFonts w:eastAsia="Times New Roman" w:cs="Arial"/>
-                <w:kern w:val="0"/>
-                <w:lang w:eastAsia="pl-PL"/>
-                <w14:ligatures w14:val="none"/>
-              </w:rPr>
-            </w:pPr>
-            <w:r>
-              <w:rPr>
-                <w:rFonts w:eastAsia="Times New Roman" w:cs="Arial"/>
-                <w:kern w:val="0"/>
-                <w:lang w:eastAsia="pl-PL"/>
-                <w14:ligatures w14:val="none"/>
-              </w:rPr>
-              <w:t>Liczne starcia zakończone dominacją jednej strony, bez przesunięć terytorialnych.</w:t>
-            </w:r>
-          </w:p>
-        </w:tc>
-      </w:tr>
-      <w:tr>
-        <w:trPr>
-          <w:tblCellSpacing w:w="15" w:type="dxa"/>
-        </w:trPr>
-        <w:tc>
-          <w:tcPr>
-            <w:tcW w:w="0" w:type="auto"/>
-            <w:tcBorders>
-              <w:top w:val="single" w:sz="6" w:space="0" w:color="C4C7C5"/>
-              <w:left w:val="single" w:sz="6" w:space="0" w:color="C4C7C5"/>
-              <w:bottom w:val="single" w:sz="6" w:space="0" w:color="C4C7C5"/>
-              <w:right w:val="single" w:sz="6" w:space="0" w:color="C4C7C5"/>
-            </w:tcBorders>
-            <w:tcMar>
-              <w:top w:w="120" w:type="dxa"/>
-              <w:left w:w="180" w:type="dxa"/>
-              <w:bottom w:w="120" w:type="dxa"/>
-              <w:right w:w="180" w:type="dxa"/>
-            </w:tcMar>
-            <w:vAlign w:val="center"/>
-            <w:hideMark/>
-          </w:tcPr>
-          <w:p>
-            <w:pPr>
-              <w:spacing w:after="0" w:line="240" w:lineRule="auto"/>
-              <w:rPr>
-                <w:rFonts w:eastAsia="Times New Roman" w:cs="Arial"/>
-                <w:kern w:val="0"/>
-                <w:lang w:eastAsia="pl-PL"/>
-                <w14:ligatures w14:val="none"/>
-              </w:rPr>
-            </w:pPr>
-            <w:r>
-              <w:rPr>
-                <w:rFonts w:eastAsia="Times New Roman" w:cs="Arial"/>
-                <w:b/>
-                <w:bCs/>
-                <w:kern w:val="0"/>
-                <w:lang w:eastAsia="pl-PL"/>
-                <w14:ligatures w14:val="none"/>
-              </w:rPr>
-              <w:t>WYSOKI (HIGH)</w:t>
-            </w:r>
-          </w:p>
-        </w:tc>
-        <w:tc>
-          <w:tcPr>
-            <w:tcW w:w="0" w:type="auto"/>
-            <w:tcBorders>
-              <w:top w:val="single" w:sz="6" w:space="0" w:color="C4C7C5"/>
-              <w:left w:val="single" w:sz="6" w:space="0" w:color="C4C7C5"/>
-              <w:bottom w:val="single" w:sz="6" w:space="0" w:color="C4C7C5"/>
-              <w:right w:val="single" w:sz="6" w:space="0" w:color="C4C7C5"/>
-            </w:tcBorders>
-            <w:tcMar>
-              <w:top w:w="120" w:type="dxa"/>
-              <w:left w:w="180" w:type="dxa"/>
-              <w:bottom w:w="120" w:type="dxa"/>
-              <w:right w:w="180" w:type="dxa"/>
-            </w:tcMar>
-            <w:vAlign w:val="center"/>
-            <w:hideMark/>
-          </w:tcPr>
-          <w:p>
-            <w:pPr>
-              <w:spacing w:after="0" w:line="240" w:lineRule="auto"/>
-              <w:rPr>
-                <w:rFonts w:eastAsia="Times New Roman" w:cs="Arial"/>
-                <w:kern w:val="0"/>
-                <w:lang w:eastAsia="pl-PL"/>
-                <w14:ligatures w14:val="none"/>
-              </w:rPr>
-            </w:pPr>
-            <w:r>
-              <w:rPr>
-                <w:rFonts w:eastAsia="Times New Roman" w:cs="Arial"/>
-                <w:b/>
-                <w:bCs/>
-                <w:kern w:val="0"/>
-                <w:lang w:eastAsia="pl-PL"/>
-                <w14:ligatures w14:val="none"/>
-              </w:rPr>
-              <w:t>ŚREDNI (MEDIUM)</w:t>
-            </w:r>
-          </w:p>
-        </w:tc>
-        <w:tc>
-          <w:tcPr>
-            <w:tcW w:w="0" w:type="auto"/>
-            <w:tcBorders>
-              <w:top w:val="single" w:sz="6" w:space="0" w:color="C4C7C5"/>
-              <w:left w:val="single" w:sz="6" w:space="0" w:color="C4C7C5"/>
-              <w:bottom w:val="single" w:sz="6" w:space="0" w:color="C4C7C5"/>
-              <w:right w:val="single" w:sz="6" w:space="0" w:color="C4C7C5"/>
-            </w:tcBorders>
-            <w:tcMar>
-              <w:top w:w="120" w:type="dxa"/>
-              <w:left w:w="180" w:type="dxa"/>
-              <w:bottom w:w="120" w:type="dxa"/>
-              <w:right w:w="180" w:type="dxa"/>
-            </w:tcMar>
-            <w:vAlign w:val="center"/>
-            <w:hideMark/>
-          </w:tcPr>
-          <w:p>
-            <w:pPr>
-              <w:spacing w:after="0" w:line="240" w:lineRule="auto"/>
-              <w:rPr>
-                <w:rFonts w:eastAsia="Times New Roman" w:cs="Arial"/>
-                <w:kern w:val="0"/>
-                <w:lang w:eastAsia="pl-PL"/>
-                <w14:ligatures w14:val="none"/>
-              </w:rPr>
-            </w:pPr>
-            <w:r>
-              <w:rPr>
-                <w:rFonts w:eastAsia="Times New Roman" w:cs="Arial"/>
-                <w:b/>
-                <w:bCs/>
-                <w:kern w:val="0"/>
-                <w:lang w:eastAsia="pl-PL"/>
-                <w14:ligatures w14:val="none"/>
-              </w:rPr>
-              <w:t>NISKI (LOW)</w:t>
-            </w:r>
-          </w:p>
-        </w:tc>
-        <w:tc>
-          <w:tcPr>
-            <w:tcW w:w="0" w:type="auto"/>
-            <w:tcBorders>
-              <w:top w:val="single" w:sz="6" w:space="0" w:color="C4C7C5"/>
-              <w:left w:val="single" w:sz="6" w:space="0" w:color="C4C7C5"/>
-              <w:bottom w:val="single" w:sz="6" w:space="0" w:color="C4C7C5"/>
-              <w:right w:val="single" w:sz="6" w:space="0" w:color="C4C7C5"/>
-            </w:tcBorders>
-            <w:tcMar>
-              <w:top w:w="120" w:type="dxa"/>
-              <w:left w:w="180" w:type="dxa"/>
-              <w:bottom w:w="120" w:type="dxa"/>
-              <w:right w:w="180" w:type="dxa"/>
-            </w:tcMar>
-            <w:vAlign w:val="center"/>
-            <w:hideMark/>
-          </w:tcPr>
-          <w:p>
-            <w:pPr>
-              <w:spacing w:after="0" w:line="240" w:lineRule="auto"/>
-              <w:rPr>
-                <w:rFonts w:eastAsia="Times New Roman" w:cs="Arial"/>
-                <w:kern w:val="0"/>
-                <w:lang w:eastAsia="pl-PL"/>
-                <w14:ligatures w14:val="none"/>
-              </w:rPr>
-            </w:pPr>
-            <w:r>
-              <w:rPr>
-                <w:rFonts w:eastAsia="Times New Roman" w:cs="Arial"/>
-                <w:b/>
-                <w:bCs/>
-                <w:kern w:val="0"/>
-                <w:lang w:eastAsia="pl-PL"/>
-                <w14:ligatures w14:val="none"/>
-              </w:rPr>
-              <w:t>ŚREDNI (MEDIUM)</w:t>
-            </w:r>
-          </w:p>
-        </w:tc>
-        <w:tc>
-          <w:tcPr>
-            <w:tcW w:w="0" w:type="auto"/>
-            <w:tcBorders>
-              <w:top w:val="single" w:sz="6" w:space="0" w:color="C4C7C5"/>
-              <w:left w:val="single" w:sz="6" w:space="0" w:color="C4C7C5"/>
-              <w:bottom w:val="single" w:sz="6" w:space="0" w:color="C4C7C5"/>
-              <w:right w:val="single" w:sz="6" w:space="0" w:color="C4C7C5"/>
-            </w:tcBorders>
-            <w:tcMar>
-              <w:top w:w="120" w:type="dxa"/>
-              <w:left w:w="180" w:type="dxa"/>
-              <w:bottom w:w="120" w:type="dxa"/>
-              <w:right w:w="180" w:type="dxa"/>
-            </w:tcMar>
-            <w:vAlign w:val="center"/>
-            <w:hideMark/>
-          </w:tcPr>
-          <w:p>
-            <w:pPr>
-              <w:spacing w:after="0" w:line="240" w:lineRule="auto"/>
-              <w:rPr>
-                <w:rFonts w:eastAsia="Times New Roman" w:cs="Arial"/>
-                <w:kern w:val="0"/>
-                <w:lang w:eastAsia="pl-PL"/>
-                <w14:ligatures w14:val="none"/>
-              </w:rPr>
-            </w:pPr>
-            <w:r>
-              <w:rPr>
-                <w:rFonts w:eastAsia="Times New Roman" w:cs="Arial"/>
-                <w:kern w:val="0"/>
-                <w:lang w:eastAsia="pl-PL"/>
-                <w14:ligatures w14:val="none"/>
-              </w:rPr>
-              <w:t>Częste bitwy i umiarkowany ruch frontu, ale bez wyraźnych zwrotów akcji.</w:t>
-            </w:r>
-          </w:p>
-        </w:tc>
-      </w:tr>
-      <w:tr>
-        <w:trPr>
-          <w:tblCellSpacing w:w="15" w:type="dxa"/>
-        </w:trPr>
-        <w:tc>
-          <w:tcPr>
-            <w:tcW w:w="0" w:type="auto"/>
-            <w:tcBorders>
-              <w:top w:val="single" w:sz="6" w:space="0" w:color="C4C7C5"/>
-              <w:left w:val="single" w:sz="6" w:space="0" w:color="C4C7C5"/>
-              <w:bottom w:val="single" w:sz="6" w:space="0" w:color="C4C7C5"/>
-              <w:right w:val="single" w:sz="6" w:space="0" w:color="C4C7C5"/>
-            </w:tcBorders>
-            <w:tcMar>
-              <w:top w:w="120" w:type="dxa"/>
-              <w:left w:w="180" w:type="dxa"/>
-              <w:bottom w:w="120" w:type="dxa"/>
-              <w:right w:w="180" w:type="dxa"/>
-            </w:tcMar>
-            <w:vAlign w:val="center"/>
-            <w:hideMark/>
-          </w:tcPr>
-          <w:p>
-            <w:pPr>
-              <w:spacing w:after="0" w:line="240" w:lineRule="auto"/>
-              <w:rPr>
-                <w:rFonts w:eastAsia="Times New Roman" w:cs="Arial"/>
-                <w:kern w:val="0"/>
-                <w:lang w:eastAsia="pl-PL"/>
-                <w14:ligatures w14:val="none"/>
-              </w:rPr>
-            </w:pPr>
-            <w:r>
-              <w:rPr>
-                <w:rFonts w:eastAsia="Times New Roman" w:cs="Arial"/>
-                <w:b/>
-                <w:bCs/>
-                <w:kern w:val="0"/>
-                <w:lang w:eastAsia="pl-PL"/>
-                <w14:ligatures w14:val="none"/>
-              </w:rPr>
-              <w:t>WYSOKI (HIGH)</w:t>
-            </w:r>
-          </w:p>
-        </w:tc>
-        <w:tc>
-          <w:tcPr>
-            <w:tcW w:w="0" w:type="auto"/>
-            <w:tcBorders>
-              <w:top w:val="single" w:sz="6" w:space="0" w:color="C4C7C5"/>
-              <w:left w:val="single" w:sz="6" w:space="0" w:color="C4C7C5"/>
-              <w:bottom w:val="single" w:sz="6" w:space="0" w:color="C4C7C5"/>
-              <w:right w:val="single" w:sz="6" w:space="0" w:color="C4C7C5"/>
-            </w:tcBorders>
-            <w:tcMar>
-              <w:top w:w="120" w:type="dxa"/>
-              <w:left w:w="180" w:type="dxa"/>
-              <w:bottom w:w="120" w:type="dxa"/>
-              <w:right w:w="180" w:type="dxa"/>
-            </w:tcMar>
-            <w:vAlign w:val="center"/>
-            <w:hideMark/>
-          </w:tcPr>
-          <w:p>
-            <w:pPr>
-              <w:spacing w:after="0" w:line="240" w:lineRule="auto"/>
-              <w:rPr>
-                <w:rFonts w:eastAsia="Times New Roman" w:cs="Arial"/>
-                <w:kern w:val="0"/>
-                <w:lang w:eastAsia="pl-PL"/>
-                <w14:ligatures w14:val="none"/>
-              </w:rPr>
-            </w:pPr>
-            <w:r>
-              <w:rPr>
-                <w:rFonts w:eastAsia="Times New Roman" w:cs="Arial"/>
-                <w:b/>
-                <w:bCs/>
-                <w:kern w:val="0"/>
-                <w:lang w:eastAsia="pl-PL"/>
-                <w14:ligatures w14:val="none"/>
-              </w:rPr>
-              <w:t>ŚREDNI (MEDIUM)</w:t>
-            </w:r>
-          </w:p>
-        </w:tc>
-        <w:tc>
-          <w:tcPr>
-            <w:tcW w:w="0" w:type="auto"/>
-            <w:tcBorders>
-              <w:top w:val="single" w:sz="6" w:space="0" w:color="C4C7C5"/>
-              <w:left w:val="single" w:sz="6" w:space="0" w:color="C4C7C5"/>
-              <w:bottom w:val="single" w:sz="6" w:space="0" w:color="C4C7C5"/>
-              <w:right w:val="single" w:sz="6" w:space="0" w:color="C4C7C5"/>
-            </w:tcBorders>
-            <w:tcMar>
-              <w:top w:w="120" w:type="dxa"/>
-              <w:left w:w="180" w:type="dxa"/>
-              <w:bottom w:w="120" w:type="dxa"/>
-              <w:right w:w="180" w:type="dxa"/>
-            </w:tcMar>
-            <w:vAlign w:val="center"/>
-            <w:hideMark/>
-          </w:tcPr>
-          <w:p>
-            <w:pPr>
-              <w:spacing w:after="0" w:line="240" w:lineRule="auto"/>
-              <w:rPr>
-                <w:rFonts w:eastAsia="Times New Roman" w:cs="Arial"/>
-                <w:kern w:val="0"/>
-                <w:lang w:eastAsia="pl-PL"/>
-                <w14:ligatures w14:val="none"/>
-              </w:rPr>
-            </w:pPr>
-            <w:r>
-              <w:rPr>
-                <w:rFonts w:eastAsia="Times New Roman" w:cs="Arial"/>
-                <w:b/>
-                <w:bCs/>
-                <w:kern w:val="0"/>
-                <w:lang w:eastAsia="pl-PL"/>
-                <w14:ligatures w14:val="none"/>
-              </w:rPr>
-              <w:t>ŚREDNI (MEDIUM)</w:t>
-            </w:r>
-          </w:p>
-        </w:tc>
-        <w:tc>
-          <w:tcPr>
-            <w:tcW w:w="0" w:type="auto"/>
-            <w:tcBorders>
-              <w:top w:val="single" w:sz="6" w:space="0" w:color="C4C7C5"/>
-              <w:left w:val="single" w:sz="6" w:space="0" w:color="C4C7C5"/>
-              <w:bottom w:val="single" w:sz="6" w:space="0" w:color="C4C7C5"/>
-              <w:right w:val="single" w:sz="6" w:space="0" w:color="C4C7C5"/>
-            </w:tcBorders>
-            <w:tcMar>
-              <w:top w:w="120" w:type="dxa"/>
-              <w:left w:w="180" w:type="dxa"/>
-              <w:bottom w:w="120" w:type="dxa"/>
-              <w:right w:w="180" w:type="dxa"/>
-            </w:tcMar>
-            <w:vAlign w:val="center"/>
-            <w:hideMark/>
-          </w:tcPr>
-          <w:p>
-            <w:pPr>
-              <w:spacing w:after="0" w:line="240" w:lineRule="auto"/>
-              <w:rPr>
-                <w:rFonts w:eastAsia="Times New Roman" w:cs="Arial"/>
-                <w:kern w:val="0"/>
-                <w:lang w:eastAsia="pl-PL"/>
-                <w14:ligatures w14:val="none"/>
-              </w:rPr>
-            </w:pPr>
-            <w:r>
-              <w:rPr>
-                <w:rFonts w:eastAsia="Times New Roman" w:cs="Arial"/>
-                <w:b/>
-                <w:bCs/>
-                <w:kern w:val="0"/>
-                <w:lang w:eastAsia="pl-PL"/>
-                <w14:ligatures w14:val="none"/>
-              </w:rPr>
-              <w:t>WYSOKI (HIGH)</w:t>
-            </w:r>
-          </w:p>
-        </w:tc>
-        <w:tc>
-          <w:tcPr>
-            <w:tcW w:w="0" w:type="auto"/>
-            <w:tcBorders>
-              <w:top w:val="single" w:sz="6" w:space="0" w:color="C4C7C5"/>
-              <w:left w:val="single" w:sz="6" w:space="0" w:color="C4C7C5"/>
-              <w:bottom w:val="single" w:sz="6" w:space="0" w:color="C4C7C5"/>
-              <w:right w:val="single" w:sz="6" w:space="0" w:color="C4C7C5"/>
-            </w:tcBorders>
-            <w:tcMar>
-              <w:top w:w="120" w:type="dxa"/>
-              <w:left w:w="180" w:type="dxa"/>
-              <w:bottom w:w="120" w:type="dxa"/>
-              <w:right w:w="180" w:type="dxa"/>
-            </w:tcMar>
-            <w:vAlign w:val="center"/>
-            <w:hideMark/>
-          </w:tcPr>
-          <w:p>
-            <w:pPr>
-              <w:spacing w:after="0" w:line="240" w:lineRule="auto"/>
-              <w:rPr>
-                <w:rFonts w:eastAsia="Times New Roman" w:cs="Arial"/>
-                <w:kern w:val="0"/>
-                <w:lang w:eastAsia="pl-PL"/>
-                <w14:ligatures w14:val="none"/>
-              </w:rPr>
-            </w:pPr>
-            <w:r>
-              <w:rPr>
-                <w:rFonts w:eastAsia="Times New Roman" w:cs="Arial"/>
-                <w:kern w:val="0"/>
-                <w:lang w:eastAsia="pl-PL"/>
-                <w14:ligatures w14:val="none"/>
-              </w:rPr>
-              <w:t>Liczne starcia, ruchomy front i wychylenia przewagi pozwalające na odwrócenie losów.</w:t>
-            </w:r>
-          </w:p>
-        </w:tc>
-      </w:tr>
-      <w:tr>
-        <w:trPr>
-          <w:tblCellSpacing w:w="15" w:type="dxa"/>
-        </w:trPr>
-        <w:tc>
-          <w:tcPr>
-            <w:tcW w:w="0" w:type="auto"/>
-            <w:tcBorders>
-              <w:top w:val="single" w:sz="6" w:space="0" w:color="C4C7C5"/>
-              <w:left w:val="single" w:sz="6" w:space="0" w:color="C4C7C5"/>
-              <w:bottom w:val="single" w:sz="6" w:space="0" w:color="C4C7C5"/>
-              <w:right w:val="single" w:sz="6" w:space="0" w:color="C4C7C5"/>
-            </w:tcBorders>
-            <w:tcMar>
-              <w:top w:w="120" w:type="dxa"/>
-              <w:left w:w="180" w:type="dxa"/>
-              <w:bottom w:w="120" w:type="dxa"/>
-              <w:right w:w="180" w:type="dxa"/>
-            </w:tcMar>
-            <w:vAlign w:val="center"/>
-            <w:hideMark/>
-          </w:tcPr>
-          <w:p>
-            <w:pPr>
-              <w:spacing w:after="0" w:line="240" w:lineRule="auto"/>
-              <w:rPr>
-                <w:rFonts w:eastAsia="Times New Roman" w:cs="Arial"/>
-                <w:kern w:val="0"/>
-                <w:lang w:eastAsia="pl-PL"/>
-                <w14:ligatures w14:val="none"/>
-              </w:rPr>
-            </w:pPr>
-            <w:r>
-              <w:rPr>
-                <w:rFonts w:eastAsia="Times New Roman" w:cs="Arial"/>
-                <w:b/>
-                <w:bCs/>
-                <w:kern w:val="0"/>
-                <w:lang w:eastAsia="pl-PL"/>
-                <w14:ligatures w14:val="none"/>
-              </w:rPr>
-              <w:t>WYSOKI (HIGH)</w:t>
-            </w:r>
-          </w:p>
-        </w:tc>
-        <w:tc>
-          <w:tcPr>
-            <w:tcW w:w="0" w:type="auto"/>
-            <w:tcBorders>
-              <w:top w:val="single" w:sz="6" w:space="0" w:color="C4C7C5"/>
-              <w:left w:val="single" w:sz="6" w:space="0" w:color="C4C7C5"/>
-              <w:bottom w:val="single" w:sz="6" w:space="0" w:color="C4C7C5"/>
-              <w:right w:val="single" w:sz="6" w:space="0" w:color="C4C7C5"/>
-            </w:tcBorders>
-            <w:tcMar>
-              <w:top w:w="120" w:type="dxa"/>
-              <w:left w:w="180" w:type="dxa"/>
-              <w:bottom w:w="120" w:type="dxa"/>
-              <w:right w:w="180" w:type="dxa"/>
-            </w:tcMar>
-            <w:vAlign w:val="center"/>
-            <w:hideMark/>
-          </w:tcPr>
-          <w:p>
-            <w:pPr>
-              <w:spacing w:after="0" w:line="240" w:lineRule="auto"/>
-              <w:rPr>
-                <w:rFonts w:eastAsia="Times New Roman" w:cs="Arial"/>
-                <w:kern w:val="0"/>
-                <w:lang w:eastAsia="pl-PL"/>
-                <w14:ligatures w14:val="none"/>
-              </w:rPr>
-            </w:pPr>
-            <w:r>
-              <w:rPr>
-                <w:rFonts w:eastAsia="Times New Roman" w:cs="Arial"/>
-                <w:b/>
-                <w:bCs/>
-                <w:kern w:val="0"/>
-                <w:lang w:eastAsia="pl-PL"/>
-                <w14:ligatures w14:val="none"/>
-              </w:rPr>
-              <w:t>ŚREDNI (MEDIUM)</w:t>
-            </w:r>
-          </w:p>
-        </w:tc>
-        <w:tc>
-          <w:tcPr>
-            <w:tcW w:w="0" w:type="auto"/>
-            <w:tcBorders>
-              <w:top w:val="single" w:sz="6" w:space="0" w:color="C4C7C5"/>
-              <w:left w:val="single" w:sz="6" w:space="0" w:color="C4C7C5"/>
-              <w:bottom w:val="single" w:sz="6" w:space="0" w:color="C4C7C5"/>
-              <w:right w:val="single" w:sz="6" w:space="0" w:color="C4C7C5"/>
-            </w:tcBorders>
-            <w:tcMar>
-              <w:top w:w="120" w:type="dxa"/>
-              <w:left w:w="180" w:type="dxa"/>
-              <w:bottom w:w="120" w:type="dxa"/>
-              <w:right w:w="180" w:type="dxa"/>
-            </w:tcMar>
-            <w:vAlign w:val="center"/>
-            <w:hideMark/>
-          </w:tcPr>
-          <w:p>
-            <w:pPr>
-              <w:spacing w:after="0" w:line="240" w:lineRule="auto"/>
-              <w:rPr>
-                <w:rFonts w:eastAsia="Times New Roman" w:cs="Arial"/>
-                <w:kern w:val="0"/>
-                <w:lang w:eastAsia="pl-PL"/>
-                <w14:ligatures w14:val="none"/>
-              </w:rPr>
-            </w:pPr>
-            <w:r>
-              <w:rPr>
-                <w:rFonts w:eastAsia="Times New Roman" w:cs="Arial"/>
-                <w:b/>
-                <w:bCs/>
-                <w:kern w:val="0"/>
-                <w:lang w:eastAsia="pl-PL"/>
-                <w14:ligatures w14:val="none"/>
-              </w:rPr>
-              <w:t>WYSOKI (HIGH)</w:t>
-            </w:r>
-          </w:p>
-        </w:tc>
-        <w:tc>
-          <w:tcPr>
-            <w:tcW w:w="0" w:type="auto"/>
-            <w:tcBorders>
-              <w:top w:val="single" w:sz="6" w:space="0" w:color="C4C7C5"/>
-              <w:left w:val="single" w:sz="6" w:space="0" w:color="C4C7C5"/>
-              <w:bottom w:val="single" w:sz="6" w:space="0" w:color="C4C7C5"/>
-              <w:right w:val="single" w:sz="6" w:space="0" w:color="C4C7C5"/>
-            </w:tcBorders>
-            <w:tcMar>
-              <w:top w:w="120" w:type="dxa"/>
-              <w:left w:w="180" w:type="dxa"/>
-              <w:bottom w:w="120" w:type="dxa"/>
-              <w:right w:w="180" w:type="dxa"/>
-            </w:tcMar>
-            <w:vAlign w:val="center"/>
-            <w:hideMark/>
-          </w:tcPr>
-          <w:p>
-            <w:pPr>
-              <w:spacing w:after="0" w:line="240" w:lineRule="auto"/>
-              <w:rPr>
-                <w:rFonts w:eastAsia="Times New Roman" w:cs="Arial"/>
-                <w:kern w:val="0"/>
-                <w:lang w:eastAsia="pl-PL"/>
-                <w14:ligatures w14:val="none"/>
-              </w:rPr>
-            </w:pPr>
-            <w:r>
-              <w:rPr>
-                <w:rFonts w:eastAsia="Times New Roman" w:cs="Arial"/>
-                <w:b/>
-                <w:bCs/>
-                <w:kern w:val="0"/>
-                <w:lang w:eastAsia="pl-PL"/>
-                <w14:ligatures w14:val="none"/>
-              </w:rPr>
-              <w:t>ŚREDNI (MEDIUM)</w:t>
-            </w:r>
-          </w:p>
-        </w:tc>
-        <w:tc>
-          <w:tcPr>
-            <w:tcW w:w="0" w:type="auto"/>
-            <w:tcBorders>
-              <w:top w:val="single" w:sz="6" w:space="0" w:color="C4C7C5"/>
-              <w:left w:val="single" w:sz="6" w:space="0" w:color="C4C7C5"/>
-              <w:bottom w:val="single" w:sz="6" w:space="0" w:color="C4C7C5"/>
-              <w:right w:val="single" w:sz="6" w:space="0" w:color="C4C7C5"/>
-            </w:tcBorders>
-            <w:tcMar>
-              <w:top w:w="120" w:type="dxa"/>
-              <w:left w:w="180" w:type="dxa"/>
-              <w:bottom w:w="120" w:type="dxa"/>
-              <w:right w:w="180" w:type="dxa"/>
-            </w:tcMar>
-            <w:vAlign w:val="center"/>
-            <w:hideMark/>
-          </w:tcPr>
-          <w:p>
-            <w:pPr>
-              <w:spacing w:after="0" w:line="240" w:lineRule="auto"/>
-              <w:rPr>
-                <w:rFonts w:eastAsia="Times New Roman" w:cs="Arial"/>
-                <w:kern w:val="0"/>
-                <w:lang w:eastAsia="pl-PL"/>
-                <w14:ligatures w14:val="none"/>
-              </w:rPr>
-            </w:pPr>
-            <w:r>
-              <w:rPr>
-                <w:rFonts w:eastAsia="Times New Roman" w:cs="Arial"/>
-                <w:kern w:val="0"/>
-                <w:lang w:eastAsia="pl-PL"/>
-                <w14:ligatures w14:val="none"/>
-              </w:rPr>
-              <w:t>Intensywne walki, lecz przewaga urosła do poziomu jednostronnej dominacji.</w:t>
-            </w:r>
-          </w:p>
-        </w:tc>
-      </w:tr>
-      <w:tr>
-        <w:trPr>
-          <w:tblCellSpacing w:w="15" w:type="dxa"/>
-        </w:trPr>
-        <w:tc>
-          <w:tcPr>
-            <w:tcW w:w="0" w:type="auto"/>
-            <w:tcBorders>
-              <w:top w:val="single" w:sz="6" w:space="0" w:color="C4C7C5"/>
-              <w:left w:val="single" w:sz="6" w:space="0" w:color="C4C7C5"/>
-              <w:bottom w:val="single" w:sz="6" w:space="0" w:color="C4C7C5"/>
-              <w:right w:val="single" w:sz="6" w:space="0" w:color="C4C7C5"/>
-            </w:tcBorders>
-            <w:tcMar>
-              <w:top w:w="120" w:type="dxa"/>
-              <w:left w:w="180" w:type="dxa"/>
-              <w:bottom w:w="120" w:type="dxa"/>
-              <w:right w:w="180" w:type="dxa"/>
-            </w:tcMar>
-            <w:vAlign w:val="center"/>
-            <w:hideMark/>
-          </w:tcPr>
-          <w:p>
-            <w:pPr>
-              <w:spacing w:after="0" w:line="240" w:lineRule="auto"/>
-              <w:rPr>
-                <w:rFonts w:eastAsia="Times New Roman" w:cs="Arial"/>
-                <w:kern w:val="0"/>
-                <w:lang w:eastAsia="pl-PL"/>
-                <w14:ligatures w14:val="none"/>
-              </w:rPr>
-            </w:pPr>
-            <w:r>
-              <w:rPr>
-                <w:rFonts w:eastAsia="Times New Roman" w:cs="Arial"/>
-                <w:b/>
-                <w:bCs/>
-                <w:kern w:val="0"/>
-                <w:lang w:eastAsia="pl-PL"/>
-                <w14:ligatures w14:val="none"/>
-              </w:rPr>
-              <w:t>WYSOKI (HIGH)</w:t>
-            </w:r>
-          </w:p>
-        </w:tc>
-        <w:tc>
-          <w:tcPr>
-            <w:tcW w:w="0" w:type="auto"/>
-            <w:tcBorders>
-              <w:top w:val="single" w:sz="6" w:space="0" w:color="C4C7C5"/>
-              <w:left w:val="single" w:sz="6" w:space="0" w:color="C4C7C5"/>
-              <w:bottom w:val="single" w:sz="6" w:space="0" w:color="C4C7C5"/>
-              <w:right w:val="single" w:sz="6" w:space="0" w:color="C4C7C5"/>
-            </w:tcBorders>
-            <w:tcMar>
-              <w:top w:w="120" w:type="dxa"/>
-              <w:left w:w="180" w:type="dxa"/>
-              <w:bottom w:w="120" w:type="dxa"/>
-              <w:right w:w="180" w:type="dxa"/>
-            </w:tcMar>
-            <w:vAlign w:val="center"/>
-            <w:hideMark/>
-          </w:tcPr>
-          <w:p>
-            <w:pPr>
-              <w:spacing w:after="0" w:line="240" w:lineRule="auto"/>
-              <w:rPr>
-                <w:rFonts w:eastAsia="Times New Roman" w:cs="Arial"/>
-                <w:kern w:val="0"/>
-                <w:lang w:eastAsia="pl-PL"/>
-                <w14:ligatures w14:val="none"/>
-              </w:rPr>
-            </w:pPr>
-            <w:r>
-              <w:rPr>
-                <w:rFonts w:eastAsia="Times New Roman" w:cs="Arial"/>
-                <w:b/>
-                <w:bCs/>
-                <w:kern w:val="0"/>
-                <w:lang w:eastAsia="pl-PL"/>
-                <w14:ligatures w14:val="none"/>
-              </w:rPr>
-              <w:t>WYSOKI (HIGH)</w:t>
-            </w:r>
-          </w:p>
-        </w:tc>
-        <w:tc>
-          <w:tcPr>
-            <w:tcW w:w="0" w:type="auto"/>
-            <w:tcBorders>
-              <w:top w:val="single" w:sz="6" w:space="0" w:color="C4C7C5"/>
-              <w:left w:val="single" w:sz="6" w:space="0" w:color="C4C7C5"/>
-              <w:bottom w:val="single" w:sz="6" w:space="0" w:color="C4C7C5"/>
-              <w:right w:val="single" w:sz="6" w:space="0" w:color="C4C7C5"/>
-            </w:tcBorders>
-            <w:tcMar>
-              <w:top w:w="120" w:type="dxa"/>
-              <w:left w:w="180" w:type="dxa"/>
-              <w:bottom w:w="120" w:type="dxa"/>
-              <w:right w:w="180" w:type="dxa"/>
-            </w:tcMar>
-            <w:vAlign w:val="center"/>
-            <w:hideMark/>
-          </w:tcPr>
-          <w:p>
-            <w:pPr>
-              <w:spacing w:after="0" w:line="240" w:lineRule="auto"/>
-              <w:rPr>
-                <w:rFonts w:eastAsia="Times New Roman" w:cs="Arial"/>
-                <w:kern w:val="0"/>
-                <w:lang w:eastAsia="pl-PL"/>
-                <w14:ligatures w14:val="none"/>
-              </w:rPr>
-            </w:pPr>
-            <w:r>
-              <w:rPr>
-                <w:rFonts w:eastAsia="Times New Roman" w:cs="Arial"/>
-                <w:b/>
-                <w:bCs/>
-                <w:kern w:val="0"/>
-                <w:lang w:eastAsia="pl-PL"/>
-                <w14:ligatures w14:val="none"/>
-              </w:rPr>
-              <w:t>NISKI (LOW)</w:t>
-            </w:r>
-          </w:p>
-        </w:tc>
-        <w:tc>
-          <w:tcPr>
-            <w:tcW w:w="0" w:type="auto"/>
-            <w:tcBorders>
-              <w:top w:val="single" w:sz="6" w:space="0" w:color="C4C7C5"/>
-              <w:left w:val="single" w:sz="6" w:space="0" w:color="C4C7C5"/>
-              <w:bottom w:val="single" w:sz="6" w:space="0" w:color="C4C7C5"/>
-              <w:right w:val="single" w:sz="6" w:space="0" w:color="C4C7C5"/>
-            </w:tcBorders>
-            <w:tcMar>
-              <w:top w:w="120" w:type="dxa"/>
-              <w:left w:w="180" w:type="dxa"/>
-              <w:bottom w:w="120" w:type="dxa"/>
-              <w:right w:w="180" w:type="dxa"/>
-            </w:tcMar>
-            <w:vAlign w:val="center"/>
-            <w:hideMark/>
-          </w:tcPr>
-          <w:p>
-            <w:pPr>
-              <w:spacing w:after="0" w:line="240" w:lineRule="auto"/>
-              <w:rPr>
-                <w:rFonts w:eastAsia="Times New Roman" w:cs="Arial"/>
-                <w:kern w:val="0"/>
-                <w:lang w:eastAsia="pl-PL"/>
-                <w14:ligatures w14:val="none"/>
-              </w:rPr>
-            </w:pPr>
-            <w:r>
-              <w:rPr>
-                <w:rFonts w:eastAsia="Times New Roman" w:cs="Arial"/>
-                <w:b/>
-                <w:bCs/>
-                <w:kern w:val="0"/>
-                <w:lang w:eastAsia="pl-PL"/>
-                <w14:ligatures w14:val="none"/>
-              </w:rPr>
-              <w:t>WYSOKI (HIGH)</w:t>
-            </w:r>
-          </w:p>
-        </w:tc>
-        <w:tc>
-          <w:tcPr>
-            <w:tcW w:w="0" w:type="auto"/>
-            <w:tcBorders>
-              <w:top w:val="single" w:sz="6" w:space="0" w:color="C4C7C5"/>
-              <w:left w:val="single" w:sz="6" w:space="0" w:color="C4C7C5"/>
-              <w:bottom w:val="single" w:sz="6" w:space="0" w:color="C4C7C5"/>
-              <w:right w:val="single" w:sz="6" w:space="0" w:color="C4C7C5"/>
-            </w:tcBorders>
-            <w:tcMar>
-              <w:top w:w="120" w:type="dxa"/>
-              <w:left w:w="180" w:type="dxa"/>
-              <w:bottom w:w="120" w:type="dxa"/>
-              <w:right w:w="180" w:type="dxa"/>
-            </w:tcMar>
-            <w:vAlign w:val="center"/>
-            <w:hideMark/>
-          </w:tcPr>
-          <w:p>
-            <w:pPr>
-              <w:spacing w:after="0" w:line="240" w:lineRule="auto"/>
-              <w:rPr>
-                <w:rFonts w:eastAsia="Times New Roman" w:cs="Arial"/>
-                <w:kern w:val="0"/>
-                <w:lang w:eastAsia="pl-PL"/>
-                <w14:ligatures w14:val="none"/>
-              </w:rPr>
-            </w:pPr>
-            <w:r>
-              <w:rPr>
-                <w:rFonts w:eastAsia="Times New Roman" w:cs="Arial"/>
-                <w:kern w:val="0"/>
-                <w:lang w:eastAsia="pl-PL"/>
-                <w14:ligatures w14:val="none"/>
-              </w:rPr>
-              <w:t xml:space="preserve">Nieprzerwane starcia i falujący front. Wyrównana </w:t>
-              <w:lastRenderedPageBreak/>
-              <w:t>wojna na wyniszczenie.</w:t>
-            </w:r>
-          </w:p>
-        </w:tc>
-      </w:tr>
-      <w:tr>
-        <w:trPr>
-          <w:tblCellSpacing w:w="15" w:type="dxa"/>
-        </w:trPr>
-        <w:tc>
-          <w:tcPr>
-            <w:tcW w:w="0" w:type="auto"/>
-            <w:tcBorders>
-              <w:top w:val="single" w:sz="6" w:space="0" w:color="C4C7C5"/>
-              <w:left w:val="single" w:sz="6" w:space="0" w:color="C4C7C5"/>
-              <w:bottom w:val="single" w:sz="6" w:space="0" w:color="C4C7C5"/>
-              <w:right w:val="single" w:sz="6" w:space="0" w:color="C4C7C5"/>
-            </w:tcBorders>
-            <w:tcMar>
-              <w:top w:w="120" w:type="dxa"/>
-              <w:left w:w="180" w:type="dxa"/>
-              <w:bottom w:w="120" w:type="dxa"/>
-              <w:right w:w="180" w:type="dxa"/>
-            </w:tcMar>
-            <w:vAlign w:val="center"/>
-            <w:hideMark/>
-          </w:tcPr>
-          <w:p>
-            <w:pPr>
-              <w:spacing w:after="0" w:line="240" w:lineRule="auto"/>
-              <w:rPr>
-                <w:rFonts w:eastAsia="Times New Roman" w:cs="Arial"/>
-                <w:kern w:val="0"/>
-                <w:lang w:eastAsia="pl-PL"/>
-                <w14:ligatures w14:val="none"/>
-              </w:rPr>
-            </w:pPr>
-            <w:r>
-              <w:rPr>
-                <w:rFonts w:eastAsia="Times New Roman" w:cs="Arial"/>
-                <w:b/>
-                <w:bCs/>
-                <w:kern w:val="0"/>
-                <w:lang w:eastAsia="pl-PL"/>
-                <w14:ligatures w14:val="none"/>
-              </w:rPr>
-              <w:lastRenderedPageBreak/>
-              <w:t>WYSOKI (HIGH)</w:t>
-            </w:r>
-          </w:p>
-        </w:tc>
-        <w:tc>
-          <w:tcPr>
-            <w:tcW w:w="0" w:type="auto"/>
-            <w:tcBorders>
-              <w:top w:val="single" w:sz="6" w:space="0" w:color="C4C7C5"/>
-              <w:left w:val="single" w:sz="6" w:space="0" w:color="C4C7C5"/>
-              <w:bottom w:val="single" w:sz="6" w:space="0" w:color="C4C7C5"/>
-              <w:right w:val="single" w:sz="6" w:space="0" w:color="C4C7C5"/>
-            </w:tcBorders>
-            <w:tcMar>
-              <w:top w:w="120" w:type="dxa"/>
-              <w:left w:w="180" w:type="dxa"/>
-              <w:bottom w:w="120" w:type="dxa"/>
-              <w:right w:w="180" w:type="dxa"/>
-            </w:tcMar>
-            <w:vAlign w:val="center"/>
-            <w:hideMark/>
-          </w:tcPr>
-          <w:p>
-            <w:pPr>
-              <w:spacing w:after="0" w:line="240" w:lineRule="auto"/>
-              <w:rPr>
-                <w:rFonts w:eastAsia="Times New Roman" w:cs="Arial"/>
-                <w:kern w:val="0"/>
-                <w:lang w:eastAsia="pl-PL"/>
-                <w14:ligatures w14:val="none"/>
-              </w:rPr>
-            </w:pPr>
-            <w:r>
-              <w:rPr>
-                <w:rFonts w:eastAsia="Times New Roman" w:cs="Arial"/>
-                <w:b/>
-                <w:bCs/>
-                <w:kern w:val="0"/>
-                <w:lang w:eastAsia="pl-PL"/>
-                <w14:ligatures w14:val="none"/>
-              </w:rPr>
-              <w:t>WYSOKI (HIGH)</w:t>
-            </w:r>
-          </w:p>
-        </w:tc>
-        <w:tc>
-          <w:tcPr>
-            <w:tcW w:w="0" w:type="auto"/>
-            <w:tcBorders>
-              <w:top w:val="single" w:sz="6" w:space="0" w:color="C4C7C5"/>
-              <w:left w:val="single" w:sz="6" w:space="0" w:color="C4C7C5"/>
-              <w:bottom w:val="single" w:sz="6" w:space="0" w:color="C4C7C5"/>
-              <w:right w:val="single" w:sz="6" w:space="0" w:color="C4C7C5"/>
-            </w:tcBorders>
-            <w:tcMar>
-              <w:top w:w="120" w:type="dxa"/>
-              <w:left w:w="180" w:type="dxa"/>
-              <w:bottom w:w="120" w:type="dxa"/>
-              <w:right w:w="180" w:type="dxa"/>
-            </w:tcMar>
-            <w:vAlign w:val="center"/>
-            <w:hideMark/>
-          </w:tcPr>
-          <w:p>
-            <w:pPr>
-              <w:spacing w:after="0" w:line="240" w:lineRule="auto"/>
-              <w:rPr>
-                <w:rFonts w:eastAsia="Times New Roman" w:cs="Arial"/>
-                <w:kern w:val="0"/>
-                <w:lang w:eastAsia="pl-PL"/>
-                <w14:ligatures w14:val="none"/>
-              </w:rPr>
-            </w:pPr>
-            <w:r>
-              <w:rPr>
-                <w:rFonts w:eastAsia="Times New Roman" w:cs="Arial"/>
-                <w:b/>
-                <w:bCs/>
-                <w:kern w:val="0"/>
-                <w:lang w:eastAsia="pl-PL"/>
-                <w14:ligatures w14:val="none"/>
-              </w:rPr>
-              <w:t>ŚREDNI (MEDIUM)</w:t>
-            </w:r>
-          </w:p>
-        </w:tc>
-        <w:tc>
-          <w:tcPr>
-            <w:tcW w:w="0" w:type="auto"/>
-            <w:tcBorders>
-              <w:top w:val="single" w:sz="6" w:space="0" w:color="C4C7C5"/>
-              <w:left w:val="single" w:sz="6" w:space="0" w:color="C4C7C5"/>
-              <w:bottom w:val="single" w:sz="6" w:space="0" w:color="C4C7C5"/>
-              <w:right w:val="single" w:sz="6" w:space="0" w:color="C4C7C5"/>
-            </w:tcBorders>
-            <w:tcMar>
-              <w:top w:w="120" w:type="dxa"/>
-              <w:left w:w="180" w:type="dxa"/>
-              <w:bottom w:w="120" w:type="dxa"/>
-              <w:right w:w="180" w:type="dxa"/>
-            </w:tcMar>
-            <w:vAlign w:val="center"/>
-            <w:hideMark/>
-          </w:tcPr>
-          <w:p>
-            <w:pPr>
-              <w:spacing w:after="0" w:line="240" w:lineRule="auto"/>
-              <w:rPr>
-                <w:rFonts w:eastAsia="Times New Roman" w:cs="Arial"/>
-                <w:kern w:val="0"/>
-                <w:lang w:eastAsia="pl-PL"/>
-                <w14:ligatures w14:val="none"/>
-              </w:rPr>
-            </w:pPr>
-            <w:r>
-              <w:rPr>
-                <w:rFonts w:eastAsia="Times New Roman" w:cs="Arial"/>
-                <w:b/>
-                <w:bCs/>
-                <w:kern w:val="0"/>
-                <w:lang w:eastAsia="pl-PL"/>
-                <w14:ligatures w14:val="none"/>
-              </w:rPr>
-              <w:t>WYSOKI (HIGH)</w:t>
-            </w:r>
-          </w:p>
-        </w:tc>
-        <w:tc>
-          <w:tcPr>
-            <w:tcW w:w="0" w:type="auto"/>
-            <w:tcBorders>
-              <w:top w:val="single" w:sz="6" w:space="0" w:color="C4C7C5"/>
-              <w:left w:val="single" w:sz="6" w:space="0" w:color="C4C7C5"/>
-              <w:bottom w:val="single" w:sz="6" w:space="0" w:color="C4C7C5"/>
-              <w:right w:val="single" w:sz="6" w:space="0" w:color="C4C7C5"/>
-            </w:tcBorders>
-            <w:tcMar>
-              <w:top w:w="120" w:type="dxa"/>
-              <w:left w:w="180" w:type="dxa"/>
-              <w:bottom w:w="120" w:type="dxa"/>
-              <w:right w:w="180" w:type="dxa"/>
-            </w:tcMar>
-            <w:vAlign w:val="center"/>
-            <w:hideMark/>
-          </w:tcPr>
-          <w:p>
-            <w:pPr>
-              <w:spacing w:after="0" w:line="240" w:lineRule="auto"/>
-              <w:rPr>
-                <w:rFonts w:eastAsia="Times New Roman" w:cs="Arial"/>
-                <w:kern w:val="0"/>
-                <w:lang w:eastAsia="pl-PL"/>
-                <w14:ligatures w14:val="none"/>
-              </w:rPr>
-            </w:pPr>
-            <w:r>
-              <w:rPr>
-                <w:rFonts w:eastAsia="Times New Roman" w:cs="Arial"/>
-                <w:kern w:val="0"/>
-                <w:lang w:eastAsia="pl-PL"/>
-                <w14:ligatures w14:val="none"/>
-              </w:rPr>
-              <w:t>Wzorcowy dynamizm. Dużo bitew, ruchomy front i dramatyczne, lecz odwracalne zwroty akcji.</w:t>
-            </w:r>
-          </w:p>
-        </w:tc>
-      </w:tr>
-      <w:tr>
-        <w:trPr>
-          <w:tblCellSpacing w:w="15" w:type="dxa"/>
-        </w:trPr>
-        <w:tc>
-          <w:tcPr>
-            <w:tcW w:w="0" w:type="auto"/>
-            <w:tcBorders>
-              <w:top w:val="single" w:sz="6" w:space="0" w:color="C4C7C5"/>
-              <w:left w:val="single" w:sz="6" w:space="0" w:color="C4C7C5"/>
-              <w:bottom w:val="single" w:sz="6" w:space="0" w:color="C4C7C5"/>
-              <w:right w:val="single" w:sz="6" w:space="0" w:color="C4C7C5"/>
-            </w:tcBorders>
-            <w:tcMar>
-              <w:top w:w="120" w:type="dxa"/>
-              <w:left w:w="180" w:type="dxa"/>
-              <w:bottom w:w="120" w:type="dxa"/>
-              <w:right w:w="180" w:type="dxa"/>
-            </w:tcMar>
-            <w:vAlign w:val="center"/>
-            <w:hideMark/>
-          </w:tcPr>
-          <w:p>
-            <w:pPr>
-              <w:spacing w:after="0" w:line="240" w:lineRule="auto"/>
-              <w:rPr>
-                <w:rFonts w:eastAsia="Times New Roman" w:cs="Arial"/>
-                <w:kern w:val="0"/>
-                <w:lang w:eastAsia="pl-PL"/>
-                <w14:ligatures w14:val="none"/>
-              </w:rPr>
-            </w:pPr>
-            <w:r>
-              <w:rPr>
-                <w:rFonts w:eastAsia="Times New Roman" w:cs="Arial"/>
-                <w:b/>
-                <w:bCs/>
-                <w:kern w:val="0"/>
-                <w:lang w:eastAsia="pl-PL"/>
-                <w14:ligatures w14:val="none"/>
-              </w:rPr>
-              <w:t>WYSOKI (HIGH)</w:t>
-            </w:r>
-          </w:p>
-        </w:tc>
-        <w:tc>
-          <w:tcPr>
-            <w:tcW w:w="0" w:type="auto"/>
-            <w:tcBorders>
-              <w:top w:val="single" w:sz="6" w:space="0" w:color="C4C7C5"/>
-              <w:left w:val="single" w:sz="6" w:space="0" w:color="C4C7C5"/>
-              <w:bottom w:val="single" w:sz="6" w:space="0" w:color="C4C7C5"/>
-              <w:right w:val="single" w:sz="6" w:space="0" w:color="C4C7C5"/>
-            </w:tcBorders>
-            <w:tcMar>
-              <w:top w:w="120" w:type="dxa"/>
-              <w:left w:w="180" w:type="dxa"/>
-              <w:bottom w:w="120" w:type="dxa"/>
-              <w:right w:w="180" w:type="dxa"/>
-            </w:tcMar>
-            <w:vAlign w:val="center"/>
-            <w:hideMark/>
-          </w:tcPr>
-          <w:p>
-            <w:pPr>
-              <w:spacing w:after="0" w:line="240" w:lineRule="auto"/>
-              <w:rPr>
-                <w:rFonts w:eastAsia="Times New Roman" w:cs="Arial"/>
-                <w:kern w:val="0"/>
-                <w:lang w:eastAsia="pl-PL"/>
-                <w14:ligatures w14:val="none"/>
-              </w:rPr>
-            </w:pPr>
-            <w:r>
-              <w:rPr>
-                <w:rFonts w:eastAsia="Times New Roman" w:cs="Arial"/>
-                <w:b/>
-                <w:bCs/>
-                <w:kern w:val="0"/>
-                <w:lang w:eastAsia="pl-PL"/>
-                <w14:ligatures w14:val="none"/>
-              </w:rPr>
-              <w:t>WYSOKI (HIGH)</w:t>
-            </w:r>
-          </w:p>
-        </w:tc>
-        <w:tc>
-          <w:tcPr>
-            <w:tcW w:w="0" w:type="auto"/>
-            <w:tcBorders>
-              <w:top w:val="single" w:sz="6" w:space="0" w:color="C4C7C5"/>
-              <w:left w:val="single" w:sz="6" w:space="0" w:color="C4C7C5"/>
-              <w:bottom w:val="single" w:sz="6" w:space="0" w:color="C4C7C5"/>
-              <w:right w:val="single" w:sz="6" w:space="0" w:color="C4C7C5"/>
-            </w:tcBorders>
-            <w:tcMar>
-              <w:top w:w="120" w:type="dxa"/>
-              <w:left w:w="180" w:type="dxa"/>
-              <w:bottom w:w="120" w:type="dxa"/>
-              <w:right w:w="180" w:type="dxa"/>
-            </w:tcMar>
-            <w:vAlign w:val="center"/>
-            <w:hideMark/>
-          </w:tcPr>
-          <w:p>
-            <w:pPr>
-              <w:spacing w:after="0" w:line="240" w:lineRule="auto"/>
-              <w:rPr>
-                <w:rFonts w:eastAsia="Times New Roman" w:cs="Arial"/>
-                <w:kern w:val="0"/>
-                <w:lang w:eastAsia="pl-PL"/>
-                <w14:ligatures w14:val="none"/>
-              </w:rPr>
-            </w:pPr>
-            <w:r>
-              <w:rPr>
-                <w:rFonts w:eastAsia="Times New Roman" w:cs="Arial"/>
-                <w:b/>
-                <w:bCs/>
-                <w:kern w:val="0"/>
-                <w:lang w:eastAsia="pl-PL"/>
-                <w14:ligatures w14:val="none"/>
-              </w:rPr>
-              <w:t>WYSOKI (HIGH)</w:t>
-            </w:r>
-          </w:p>
-        </w:tc>
-        <w:tc>
-          <w:tcPr>
-            <w:tcW w:w="0" w:type="auto"/>
-            <w:tcBorders>
-              <w:top w:val="single" w:sz="6" w:space="0" w:color="C4C7C5"/>
-              <w:left w:val="single" w:sz="6" w:space="0" w:color="C4C7C5"/>
-              <w:bottom w:val="single" w:sz="6" w:space="0" w:color="C4C7C5"/>
-              <w:right w:val="single" w:sz="6" w:space="0" w:color="C4C7C5"/>
-            </w:tcBorders>
-            <w:tcMar>
-              <w:top w:w="120" w:type="dxa"/>
-              <w:left w:w="180" w:type="dxa"/>
-              <w:bottom w:w="120" w:type="dxa"/>
-              <w:right w:w="180" w:type="dxa"/>
-            </w:tcMar>
-            <w:vAlign w:val="center"/>
-            <w:hideMark/>
-          </w:tcPr>
-          <w:p>
-            <w:pPr>
-              <w:spacing w:after="0" w:line="240" w:lineRule="auto"/>
-              <w:rPr>
-                <w:rFonts w:eastAsia="Times New Roman" w:cs="Arial"/>
-                <w:kern w:val="0"/>
-                <w:lang w:eastAsia="pl-PL"/>
-                <w14:ligatures w14:val="none"/>
-              </w:rPr>
-            </w:pPr>
-            <w:r>
-              <w:rPr>
-                <w:rFonts w:eastAsia="Times New Roman" w:cs="Arial"/>
-                <w:b/>
-                <w:bCs/>
-                <w:kern w:val="0"/>
-                <w:lang w:eastAsia="pl-PL"/>
-                <w14:ligatures w14:val="none"/>
-              </w:rPr>
-              <w:t>ŚREDNI (MEDIUM)</w:t>
-            </w:r>
-          </w:p>
-        </w:tc>
-        <w:tc>
-          <w:tcPr>
-            <w:tcW w:w="0" w:type="auto"/>
-            <w:tcBorders>
-              <w:top w:val="single" w:sz="6" w:space="0" w:color="C4C7C5"/>
-              <w:left w:val="single" w:sz="6" w:space="0" w:color="C4C7C5"/>
-              <w:bottom w:val="single" w:sz="6" w:space="0" w:color="C4C7C5"/>
-              <w:right w:val="single" w:sz="6" w:space="0" w:color="C4C7C5"/>
-            </w:tcBorders>
-            <w:tcMar>
-              <w:top w:w="120" w:type="dxa"/>
-              <w:left w:w="180" w:type="dxa"/>
-              <w:bottom w:w="120" w:type="dxa"/>
-              <w:right w:w="180" w:type="dxa"/>
-            </w:tcMar>
-            <w:vAlign w:val="center"/>
-            <w:hideMark/>
-          </w:tcPr>
-          <w:p>
-            <w:pPr>
-              <w:spacing w:after="0" w:line="240" w:lineRule="auto"/>
-              <w:rPr>
-                <w:rFonts w:eastAsia="Times New Roman" w:cs="Arial"/>
-                <w:kern w:val="0"/>
-                <w:lang w:eastAsia="pl-PL"/>
-                <w14:ligatures w14:val="none"/>
-              </w:rPr>
-            </w:pPr>
-            <w:r>
-              <w:rPr>
-                <w:rFonts w:eastAsia="Times New Roman" w:cs="Arial"/>
-                <w:kern w:val="0"/>
-                <w:lang w:eastAsia="pl-PL"/>
-                <w14:ligatures w14:val="none"/>
-              </w:rPr>
-              <w:t>Bardzo intensywna rozgrywka, zakończona jednak zbyt jednostronnie, by uznać ją za wzorcową.</w:t>
+              <w:t xml:space="preserve">Wzorcowy dynamizm: nieustanna wymiana pól i wielokrotne zmiany prowadzenia.</w:t>
             </w:r>
           </w:p>
         </w:tc>
@@ -10803,7 +7998,7 @@
     </w:p>
     <w:p>
       <w:r>
-        <w:t xml:space="preserve">Baza reguł jest kompletna. Liczba zmian prowadzenia operuje na profilu dwustanowym (NISKI, WYSOKI), a Wskaźnik Odbijania oraz Punkty Kulminacyjne na trójstanowym, co daje 2 × 3 × 3 = 18 kombinacji — wszystkie wymienione w powyższej tabeli.</w:t>
+        <w:t xml:space="preserve">Baza reguł jest kompletna. Liczba zmian prowadzenia operuje na profilu dwustanowym (NISKI, WYSOKI), a Wskaźnik Odbijania na trójstanowym, co daje 2 × 3 = 6 kombinacji — wszystkie wymienione w powyższej tabeli.</w:t>
       </w:r>
     </w:p>
     <w:p>
@@ -10895,7 +8090,7 @@
         </w:numPr>
       </w:pPr>
       <w:r>
-        <w:t xml:space="preserve">Territorial Imbalance: NISKI — funkcja trójkątna [0; 0; 14,6]; ŚREDNI — trójkątna [11,9; 14,6; 17,1]; WYSOKI — trapezowa [14,6; 22,6; 100; 100].</w:t>
+        <w:t xml:space="preserve">Territorial Imbalance: NISKI — funkcja trójkątna [0; 0; 14,25]; ŚREDNI — trójkątna [12,14; 14,25; 17,05]; WYSOKI — trapezowa [14,25; 23,33; 100; 100].</w:t>
       </w:r>
       <m:oMath>
         <m:r>
@@ -10931,7 +8126,7 @@
         </w:numPr>
       </w:pPr>
       <w:r>
-        <w:t xml:space="preserve">Growth Imbalance: NISKI — funkcja trójkątna [0; 0; 20,5]; ŚREDNI — trójkątna [17,3; 20,5; 23,4]; WYSOKI — trapezowa [20,5; 32,4; 100; 100].</w:t>
+        <w:t xml:space="preserve">Growth Imbalance: NISKI — funkcja trójkątna [0; 0; 19,45]; ŚREDNI — trójkątna [17,39; 19,45; 22,95]; WYSOKI — trapezowa [19,45; 32,50; 100; 100].</w:t>
       </w:r>
       <m:oMath>
         <m:r>
@@ -10967,7 +8162,7 @@
         </w:numPr>
       </w:pPr>
       <w:r>
-        <w:t xml:space="preserve">Military Imbalance: NISKI — funkcja trójkątna [0; 0; 20,7]; ŚREDNI — trójkątna [16,0; 20,7; 24,5]; WYSOKI — trapezowa [20,7; 30,6; 100; 100].</w:t>
+        <w:t xml:space="preserve">Military Imbalance: NISKI — funkcja trójkątna [0; 0; 19,48]; ŚREDNI — trójkątna [16,21; 19,48; 25,10]; WYSOKI — trapezowa [19,48; 31,05; 100; 100].</w:t>
       </w:r>
       <m:oMath>
         <m:r>
@@ -11002,18 +8197,29 @@
     </w:p>
     <w:p>
       <w:r>
-        <w:t xml:space="preserve">Zmienna operuje na profilu trójstanowym, przy czym — odmiennie niż pozostałe — wartością pożądaną jest zbiór ŚREDNI (rozdz. 7.5.D). Zmierzony rozkład obejmuje przedział 37,2–84,4% z medianą 61,7%.</w:t>
+        <w:t xml:space="preserve">Metryka nie jest wejściem systemu rozmytego, więc nie ma przypisanych funkcji przynależności. Zmierzony rozkład podajemy dla kompletności dokumentacji: przedział od 67,8 do 101,3 procent z medianą 81,1 (kwantyle 25 i 75 procent wynoszą odpowiednio 72,3 oraz 87,2).</w:t>
+      </w:r>
+    </w:p>
+    <w:p>
+      <w:r>
+        <w:t xml:space="preserve">3. Wskaźnik Odbijania (Reconquering Rate)</w:t>
+      </w:r>
+    </w:p>
+    <w:p>
+      <w:r>
+        <w:lastRenderedPageBreak/>
+        <w:t xml:space="preserve">Metryka wyrażona jest jako procent pól zmieniających właściciela w przeliczeniu na 100 tur, zgodnie ze wzorem (6). Zmierzony rozkład obejmuje przedział od 5,2 do 34,3 z medianą 18,4; uniwersum rozważań przyjęto do 60.</w:t>
       </w:r>
     </w:p>
     <w:p>
       <w:pPr>
         <w:numPr>
           <w:ilvl w:val="0"/>
-          <w:numId w:val="22"/>
+          <w:numId w:val="23"/>
         </w:numPr>
       </w:pPr>
       <w:r>
-        <w:t xml:space="preserve">NISKI (LOW): funkcja trójkątna [0; 0; 61,7]. Odpowiada meczowi o płaskim przebiegu, bez wyraźnych wychyleń przewagi.</w:t>
+        <w:t xml:space="preserve">NISKI (LOW): funkcja trójkątna [0; 0; 18,39].</w:t>
       </w:r>
       <m:oMath>
         <m:r>
@@ -11035,7 +8241,7 @@
               <w:rPr>
                 <w:rFonts w:ascii="Cambria Math" w:hAnsi="Cambria Math"/>
               </w:rPr>
-              <m:t>0,0,55</m:t>
+              <m:t>0,0,15</m:t>
             </m:r>
           </m:e>
         </m:d>
@@ -11045,11 +8251,47 @@
       <w:pPr>
         <w:numPr>
           <w:ilvl w:val="0"/>
-          <w:numId w:val="22"/>
+          <w:numId w:val="23"/>
         </w:numPr>
       </w:pPr>
       <w:r>
-        <w:t xml:space="preserve">ŚREDNI (MEDIUM): funkcja trójkątna [52,2; 61,7; 68,3]. Wartość pożądana — wychylenie na tyle duże, by stanowić zwrot akcji, lecz na tyle umiarkowane, by przeciwnik mógł wrócić do gry.</w:t>
+        <w:t xml:space="preserve">ŚREDNI (MEDIUM): funkcja trójkątna [12,34; 18,39; 27,39].</w:t>
+      </w:r>
+      <m:oMath>
+        <m:r>
+          <m:rPr>
+            <m:nor/>
+          </m:rPr>
+          <m:t>trimf</m:t>
+        </m:r>
+        <m:d>
+          <m:dPr>
+            <m:ctrlPr>
+              <w:rPr>
+                <w:rFonts w:ascii="Cambria Math" w:hAnsi="Cambria Math"/>
+              </w:rPr>
+            </m:ctrlPr>
+          </m:dPr>
+          <m:e>
+            <m:r>
+              <w:rPr>
+                <w:rFonts w:ascii="Cambria Math" w:hAnsi="Cambria Math"/>
+              </w:rPr>
+              <m:t>10,30,50</m:t>
+            </m:r>
+          </m:e>
+        </m:d>
+      </m:oMath>
+    </w:p>
+    <w:p>
+      <w:pPr>
+        <w:numPr>
+          <w:ilvl w:val="0"/>
+          <w:numId w:val="23"/>
+        </w:numPr>
+      </w:pPr>
+      <w:r>
+        <w:t xml:space="preserve">WYSOKI (HIGH): funkcja trapezowa [18,39; 34,30; 60; 60].</w:t>
       </w:r>
       <m:oMath>
         <m:r>
@@ -11071,136 +8313,6 @@
               <w:rPr>
                 <w:rFonts w:ascii="Cambria Math" w:hAnsi="Cambria Math"/>
               </w:rPr>
-              <m:t>45,75,100,100</m:t>
-            </m:r>
-          </m:e>
-        </m:d>
-      </m:oMath>
-    </w:p>
-    <w:p>
-      <w:pPr>
-        <w:numPr>
-          <w:ilvl w:val="0"/>
-          <w:numId w:val="22"/>
-        </w:numPr>
-      </w:pPr>
-      <w:r>
-        <w:t xml:space="preserve">WYSOKI (HIGH): funkcja trapezowa [61,7; 84,4; 100; 100]. Oznacza jednostronną dominację przechodzącą w rozstrzygnięcie meczu.</w:t>
-      </w:r>
-    </w:p>
-    <w:p>
-      <w:r>
-        <w:t xml:space="preserve">3. Wskaźnik Odbijania (Reconquering Rate)</w:t>
-      </w:r>
-    </w:p>
-    <w:p>
-      <w:r>
-        <w:lastRenderedPageBreak/>
-        <w:t xml:space="preserve">Metryka przyjmuje wartości przekraczające 100%, ponieważ te same pola potrafią zmieniać właściciela wielokrotnie; uniwersum rozważań rozszerzono do 200%. Zmierzony rozkład obejmuje przedział 19,3–161,2% z medianą 66,5%.</w:t>
-      </w:r>
-    </w:p>
-    <w:p>
-      <w:pPr>
-        <w:numPr>
-          <w:ilvl w:val="0"/>
-          <w:numId w:val="23"/>
-        </w:numPr>
-      </w:pPr>
-      <w:r>
-        <w:t xml:space="preserve">NISKI (LOW): funkcja trójkątna [0; 0; 66,5].</w:t>
-      </w:r>
-      <m:oMath>
-        <m:r>
-          <m:rPr>
-            <m:nor/>
-          </m:rPr>
-          <m:t>trimf</m:t>
-        </m:r>
-        <m:d>
-          <m:dPr>
-            <m:ctrlPr>
-              <w:rPr>
-                <w:rFonts w:ascii="Cambria Math" w:hAnsi="Cambria Math"/>
-              </w:rPr>
-            </m:ctrlPr>
-          </m:dPr>
-          <m:e>
-            <m:r>
-              <w:rPr>
-                <w:rFonts w:ascii="Cambria Math" w:hAnsi="Cambria Math"/>
-              </w:rPr>
-              <m:t>0,0,15</m:t>
-            </m:r>
-          </m:e>
-        </m:d>
-      </m:oMath>
-    </w:p>
-    <w:p>
-      <w:pPr>
-        <w:numPr>
-          <w:ilvl w:val="0"/>
-          <w:numId w:val="23"/>
-        </w:numPr>
-      </w:pPr>
-      <w:r>
-        <w:t xml:space="preserve">ŚREDNI (MEDIUM): funkcja trójkątna [41,4; 66,5; 100,9].</w:t>
-      </w:r>
-      <m:oMath>
-        <m:r>
-          <m:rPr>
-            <m:nor/>
-          </m:rPr>
-          <m:t>trimf</m:t>
-        </m:r>
-        <m:d>
-          <m:dPr>
-            <m:ctrlPr>
-              <w:rPr>
-                <w:rFonts w:ascii="Cambria Math" w:hAnsi="Cambria Math"/>
-              </w:rPr>
-            </m:ctrlPr>
-          </m:dPr>
-          <m:e>
-            <m:r>
-              <w:rPr>
-                <w:rFonts w:ascii="Cambria Math" w:hAnsi="Cambria Math"/>
-              </w:rPr>
-              <m:t>10,30,50</m:t>
-            </m:r>
-          </m:e>
-        </m:d>
-      </m:oMath>
-    </w:p>
-    <w:p>
-      <w:pPr>
-        <w:numPr>
-          <w:ilvl w:val="0"/>
-          <w:numId w:val="23"/>
-        </w:numPr>
-      </w:pPr>
-      <w:r>
-        <w:t xml:space="preserve">WYSOKI (HIGH): funkcja trapezowa [66,5; 161,2; 200; 200].</w:t>
-      </w:r>
-      <m:oMath>
-        <m:r>
-          <m:rPr>
-            <m:nor/>
-          </m:rPr>
-          <m:t>trapmf</m:t>
-        </m:r>
-        <m:d>
-          <m:dPr>
-            <m:ctrlPr>
-              <w:rPr>
-                <w:rFonts w:ascii="Cambria Math" w:hAnsi="Cambria Math"/>
-              </w:rPr>
-            </m:ctrlPr>
-          </m:dPr>
-          <m:e>
-            <m:r>
-              <w:rPr>
-                <w:rFonts w:ascii="Cambria Math" w:hAnsi="Cambria Math"/>
-              </w:rPr>
               <m:t>40,65,100,100</m:t>
             </m:r>
           </m:e>
@@ -11226,7 +8338,7 @@
         </w:numPr>
       </w:pPr>
       <w:r>
-        <w:t xml:space="preserve">Metryka wyrażona liczbą zdarzeń przypadających na 100 tur, a nie w procentach. Zmierzony rozkład obejmuje przedział 0,63–4,25 zmiany na 100 tur z medianą 2,66; uniwersum przyjęto do 20. Zmienna operuje na profilu dwustanowym, ponieważ interesuje nas wyłącznie kierunek „im częściej losy się odwracają, tym dynamiczniejsza mapa”.</w:t>
+        <w:t xml:space="preserve">Metryka wyrażona liczbą zdarzeń przypadających na 100 tur, a nie w procentach. Zmierzony rozkład obejmuje przedział od 0,9 do 4,9 zmiany na 100 tur z medianą 2,62; uniwersum przyjęto do 20. Zmienna operuje na profilu dwustanowym, ponieważ interesuje nas wyłącznie kierunek „im częściej losy się odwracają, tym dynamiczniejsza mapa”.</w:t>
       </w:r>
     </w:p>
     <w:p>
@@ -11237,7 +8349,7 @@
         </w:numPr>
       </w:pPr>
       <w:r>
-        <w:t xml:space="preserve">NISKI (LOW): funkcja trójkątna [0; 0; 3,29].</w:t>
+        <w:t xml:space="preserve">NISKI (LOW): funkcja trójkątna [0; 0; 3,01].</w:t>
       </w:r>
     </w:p>
     <w:p>
@@ -11248,7 +8360,7 @@
         </w:numPr>
       </w:pPr>
       <w:r>
-        <w:t xml:space="preserve">WYSOKI (HIGH): funkcja trapezowa [1,91; 4,25; 20; 20].</w:t>
+        <w:t xml:space="preserve">WYSOKI (HIGH): funkcja trapezowa [2,10; 4,91; 20; 20].</w:t>
       </w:r>
     </w:p>
     <w:p>

</xml_diff>

<commit_message>
fixes, updates, added json files
</commit_message>
<xml_diff>
--- a/GDD_zaktualizowany.docx
+++ b/GDD_zaktualizowany.docx
@@ -1464,58 +1464,7 @@
           <w:b/>
           <w:bCs/>
         </w:rPr>
-        <w:t>Kryterium Balansu (Dążenie do maksimum):</w:t>
-      </w:r>
-      <w:r>
-        <w:t xml:space="preserve"> Wyliczane na podstawie średnich wartości </w:t>
-      </w:r>
-      <w:r>
-        <w:rPr>
-          <w:b/>
-          <w:bCs/>
-          <w:i/>
-          <w:iCs/>
-        </w:rPr>
-        <w:t xml:space="preserve">Territorial Imbalance</w:t>
-      </w:r>
-      <w:r>
-        <w:t xml:space="preserve"> (nierówność terytorium), </w:t>
-      </w:r>
-      <w:r>
-        <w:rPr>
-          <w:b/>
-          <w:bCs/>
-          <w:i/>
-          <w:iCs/>
-        </w:rPr>
-        <w:t xml:space="preserve">Growth Imbalance</w:t>
-      </w:r>
-      <w:r>
-        <w:t xml:space="preserve"> (dysproporcja populacji pól) oraz </w:t>
-      </w:r>
-      <w:r>
-        <w:rPr>
-          <w:b/>
-          <w:bCs/>
-          <w:i/>
-          <w:iCs/>
-        </w:rPr>
-        <w:t xml:space="preserve">Military Imbalance</w:t>
-      </w:r>
-      <w:r>
-        <w:t xml:space="preserve"> (różnica siły armii). Im średnie różnice między botami przez cały mecz są bliższe 0%, tym wyższą ocenę Balansu otrzymuje mapa. Gry zbyt krótkie (</w:t>
-      </w:r>
-      <w:r>
-        <w:rPr>
-          <w:b/>
-          <w:bCs/>
-          <w:i/>
-          <w:iCs/>
-        </w:rPr>
-        <w:t xml:space="preserve">Game Length</w:t>
-      </w:r>
-      <w:r>
-        <w:t xml:space="preserve">) są automatycznie klasyfikowane jako niezbalansowane z powodu dominacji kuli śnieżnej. </w:t>
+        <w:t xml:space="preserve">Kryterium Balansu (Dążenie do maksimum): Wyliczane na podstawie średnich wartości Territorial Imbalance (nierówność terytorium), Growth Imbalance (dysproporcja zdolności produkcyjnej pól) oraz Military Imbalance (różnica siły armii). Im średnie różnice między botami przez cały mecz są bliższe 0%, tym wyższą ocenę Balansu otrzymuje mapa. Gry zbyt krótkie są odrzucane bramką poprawności: jeżeli metryka Game Length spadnie poniżej 15% limitu tur, czyli poniżej 75 tur, konfiguracja otrzymuje zerową ocenę obu kryteriów. Uzasadnienie tego progu jest takie samo jak przy wskaźniku podboju: rozgrywka przerwana na tak wczesnym etapie nie niesie informacji o jakości mapy, lecz o tym, że jedna ze stron rozstrzygnęła ją, zanim druga zdążyła się rozwinąć. W dotychczasowych badaniach bramka ta nie odrzuciła żadnej konfiguracji — najkrótsze zaobserwowane rozgrywki to 35% limitu na celowo zepsutej mapie kontrolnej oraz 42% w badaniu pilotażowym — pełni więc rolę zabezpieczenia na wypadek konfiguracji spoza przebadanej przestrzeni parametrów.</w:t>
       </w:r>
     </w:p>
     <w:p>
@@ -8056,12 +8005,12 @@
     <w:p>
       <w:r>
         <w:lastRenderedPageBreak/>
-        <w:t xml:space="preserve">Progi funkcji przynależności nie zostały dobrane arbitralnie, lecz wyznaczone empirycznie w badaniu pilotażowym. Przed właściwą optymalizacją przeprowadzono dwa niezależne przebiegi po 50 konfiguracji parametrów, wylosowanych metodą Latin Hypercube z całej przestrzeni genotypu, oceniając każdą w 20 meczach — łącznie 2000 rozgrywek. Każda zmienna opisana jest czterema liczbami odczytanymi z jej rozkładu empirycznego: kwantyl 25% wyznacza lewe ramię zbioru ŚREDNI, mediana jego szczyt oraz punkt przecięcia zbiorów NISKI i WYSOKI, kwantyl 75% ramię prawe, a wartość maksymalna — punkt pełnego nasycenia zbioru WYSOKI.</w:t>
-      </w:r>
-    </w:p>
-    <w:p>
-      <w:r>
-        <w:t xml:space="preserve">Umiejscowienie nasycenia na maksimum, a nie na kwantylu 75%, wynika z badania weryfikacyjnego opisanego w rozdziale 8.2. Przy nasyceniu na kwantylu 75% wszystkie konfiguracje o wartościach powyżej tego progu otrzymywały identyczną, minimalną ocenę — dotyczyło to 24% konfiguracji z badania pilotażowego, co oznaczało, że jedna czwarta przestrzeni przeszukiwania była dla algorytmu ewolucyjnego płaska. Po przesunięciu punktu nasycenia odsetek ten spadł do 2%, a liczba rozróżnialnych ocen wzrosła z 41 do 47 na 50 konfiguracji, przy zachowaniu rozrzutu ocen.</w:t>
+        <w:t xml:space="preserve">Progi funkcji przynależności nie zostały dobrane arbitralnie, lecz wyznaczone empirycznie w badaniu pilotażowym. Przeprowadzono przebieg obejmujący 50 konfiguracji parametrów, wylosowanych metodą Latin Hypercube z całej przestrzeni genotypu, oceniając każdą w 60 meczach — łącznie 3000 rozgrywek, czyli przy tej samej liczbie powtórzeń, jaką stosuje właściwa optymalizacja. Każda zmienna opisana jest czterema liczbami odczytanymi z jej rozkładu empirycznego: kwantyl 25% wyznacza lewe ramię zbioru ŚREDNI, mediana jego szczyt oraz punkt przecięcia zbiorów NISKI i WYSOKI, kwantyl 75% ramię prawe, a wartość maksymalna — punkt pełnego nasycenia zbioru WYSOKI. Wszystkie podane niżej progi pochodzą z jednego pliku wynikowego (pilotaz_wyniki.json) i są w całości odtwarzalne. Wcześniejsza kalibracja, oparta na dwóch przebiegach po 50 konfiguracji ocenianych w 20 meczach, została zastąpiona po wdrożeniu wzorów (6) i (7) z artykułu źródłowego, które zmieniły jednostki dwóch metryk.</w:t>
+      </w:r>
+    </w:p>
+    <w:p>
+      <w:r>
+        <w:t xml:space="preserve">Umiejscowienie nasycenia na maksimum, a nie na kwantylu 75%, wynika z badania weryfikacyjnego opisanego w rozdziale 8.2. Przy nasyceniu na kwantylu 75% wszystkie konfiguracje o wartościach powyżej tego progu otrzymywały identyczną, minimalną ocenę — dotyczyło to 24% konfiguracji z badania pilotażowego, co oznaczało, że jedna czwarta przestrzeni przeszukiwania była dla algorytmu ewolucyjnego płaska. Po przesunięciu punktu nasycenia odsetek ten spadł do 2%. Właściwość ta utrzymała się po ponownej kalibracji na nowym badaniu pilotażowym: na dnie skali pozostaje 1 konfiguracja z 50, a liczba rozróżnialnych ocen balansu wynosi 49 z 50.</w:t>
       </w:r>
     </w:p>
     <w:p>
@@ -8079,7 +8028,7 @@
     </w:p>
     <w:p>
       <w:r>
-        <w:t>Każda z trzech metryk balansu otrzymuje własne progi, ponieważ badanie pilotażowe wykazało, że ich rozkłady różnią się zakresem: nierównowaga terytorialna mieści się w przedziale 9,6–22,6%, gospodarcza 13,9–29,1%, a militarna 10,3–30,6%. Wspólna skala powodowałaby, że metryka o najwęższym rozkładzie nigdy nie osiągnęłaby zbioru WYSOKI. Ujednolicone pozostaje natomiast znaczenie etykiet: NISKI oznacza dolną, a WYSOKI górną część obserwowanego rozkładu danej metryki.</w:t>
+        <w:t xml:space="preserve">Każda z trzech metryk balansu otrzymuje własne progi, ponieważ badanie pilotażowe wykazało, że ich rozkłady różnią się zakresem: nierównowaga terytorialna mieści się w przedziale 8,6–23,3%, gospodarcza 12,0–32,5%, a militarna 10,7–31,1%. Wspólna skala powodowałaby, że metryka o najwęższym rozkładzie nigdy nie osiągnęłaby zbioru WYSOKI. Ujednolicone pozostaje natomiast znaczenie etykiet: NISKI oznacza dolną, a WYSOKI górną część obserwowanego rozkładu danej metryki.</w:t>
       </w:r>
     </w:p>
     <w:p>
@@ -8497,7 +8446,7 @@
     </w:p>
     <w:p>
       <w:r>
-        <w:t xml:space="preserve">0% ———————— 11,9% ——— 14,6% ——— 17,1% ———————— 22,6% ———————— 100%</w:t>
+        <w:t xml:space="preserve">0% ———————— 12,14% ——— 14,25% ——— 17,05% ———————— 23,33% ———————— 100%</w:t>
       </w:r>
     </w:p>
     <w:p>
@@ -8507,9 +8456,8 @@
     </w:p>
     <w:p>
       <w:r>
-        <w:t xml:space="preserve">Dzięki zastosowaniu powyższego podziału, jeśli symulacja wykaże na przykład nierównowagę terytorialną na poziomie 13%, system zakwalifikuje tę mapę jednocześnie do zbioru NISKI (w stopniu 0,12) oraz ŚREDNI (w stopniu 0,35). Zapobiega to gwałtownym skokom ocen (efektowi schodkowemu), gwarantując zachowanie </w:t>
+        <w:t xml:space="preserve">Dzięki zastosowaniu powyższego podziału, jeśli symulacja wykaże na przykład nierównowagę terytorialną na poziomie 13%, system zakwalifikuje tę mapę jednocześnie do zbioru NISKI (w stopniu 0,09) oraz ŚREDNI (w stopniu 0,41). Zapobiega to gwałtownym skokom ocen (efektowi schodkowemu), gwarantując zachowanie ciągłego gradientu matematycznego. Pozwala to algorytmowi ewolucyjnemu NSGA-II na płynne, stabilne i precyzyjne przeszukiwanie przestrzeni parametrów w kolejnych pokoleniach.</w:t>
         <w:lastRenderedPageBreak/>
-        <w:t>ciągłego gradientu matematycznego. Pozwala to algorytmowi ewolucyjnemu NSGA-II na płynne, stabilne i precyzyjne przeszukiwanie przestrzeni parametrów w kolejnych pokoleniach.</w:t>
       </w:r>
     </w:p>
     <w:p>
@@ -8540,22 +8488,42 @@
     </w:p>
     <w:p>
       <w:r>
-        <w:t xml:space="preserve">Wyniki potwierdziły, że każde zaburzenie zostaje wykryte przez tę metrykę, która została do tego przeznaczona. Mapa z bogatą strefą podniosła Growth Imbalance z 27,1% do 59,1%, czyli ponad dwukrotnie, co stanowi bezpośrednie potwierdzenie zasadności przedefiniowania tej metryki opisanego w rozdziale 7.4.B. Mapa z bazą zepchniętą na skraj dała najwyższą nierównowagę terytorialną (23,5%). Mapa wzorcowa uzyskała najniższe wartości wszystkich trzech nierównowag oraz dwukrotnie wyższy wskaźnik odbijania niż mapa losowa (104,2% wobec 53,4%), co odpowiada oczekiwaniu, że idealnie wyrównane siły powodują nieustanne falowanie frontu.</w:t>
-      </w:r>
-    </w:p>
-    <w:p>
-      <w:r>
-        <w:t xml:space="preserve">Szczególnie pouczający okazał się tryb z bazami ustawionymi obok siebie. Jego surowe metryki nierównowagi były najniższe z całego zestawienia (terytorialna 0,7%, militarna 3,1%), ponieważ rozgrywka kończy się, zanim którakolwiek ze stron zdąży zbudować przewagę. Bez zabezpieczenia mapa taka otrzymałaby ocenę najwyższą. Odrzuciła ją dopiero bramka poprawności oparta na wskaźniku podboju, który wyniósł 7,2% wobec progu 60%. Stanowi to empiryczne uzasadnienie decyzji z rozdziału 7.5.A o przeniesieniu tej metryki z wejść systemu do warunków dopuszczenia wyniku.</w:t>
-      </w:r>
-    </w:p>
-    <w:p>
-      <w:r>
-        <w:t xml:space="preserve">Po skorygowaniu punktu nasycenia zbiorów WYSOKI oceny końcowe układają się w oczekiwanej kolejności: mapa wzorcowa 0,590, mapa losowa 0,174, mapy zaburzone od 0,141 do 0,000. Oba warunki weryfikacji — wzorzec nie gorszy od mapy losowej oraz mapa losowa lepsza od najlepszej z zaburzonych — są spełnione.</w:t>
-      </w:r>
-    </w:p>
-    <w:p>
-      <w:r>
-        <w:t xml:space="preserve">Należy zaznaczyć, że skala ocen pozostaje względna wobec rozkładu zaobserwowanego w badaniu pilotażowym. Mapa z bogatą strefą osiąga Growth Imbalance na poziomie 59,1%, podczas gdy generator normalny wytwarza wartości z przedziału 13,9–32,4%, znajduje się więc poza zakresem kalibracji i nadal ulega nasyceniu. Nie jest to wada, lecz właściwość przyjętej metody: system kalibrowano po to, by rozróżniał mapy rzeczywiście wytwarzane przez generator, a nie by mierzył patologie w skali bezwzględnej. Z tego powodu w analizie map kontrolnych podaje się zarówno surowe metryki, jak i ocenę rozmytą.</w:t>
+        <w:t xml:space="preserve">Wyniki potwierdziły, że każde zaburzenie zostaje wykryte przez tę metrykę, która została do tego przeznaczona. Mapa z bogatą strefą podniosła Growth Imbalance z 24,5% do 58,3%, czyli ponad dwukrotnie, co stanowi bezpośrednie potwierdzenie zasadności przedefiniowania tej metryki opisanego w rozdziale 7.4.B. Mapa z bazą zepchniętą w róg dała najwyższą nierównowagę terytorialną (22,6% wobec 18,5% na mapie losowej). Mapa wzorcowa uzyskała najniższe wartości wszystkich trzech nierównowag oraz najwyższy wskaźnik odbijania (24,5 wobec 19,7 na mapie losowej), co odpowiada oczekiwaniu, że wyrównane siły powodują nieustanne falowanie frontu. Pomiar wykonano na pięciu trybach po 60 meczów, przy jednakowym dla wszystkich zestawie genów: minSpawnDistance = 12, population_max = 60, populationToCreateNewUnit = 700. Ponieważ jest to zestaw odległy od optimum wyznaczonego przez NSGA-II, bezwzględnych ocen z tego badania nie należy zestawiać z ocenami rozwiązań z frontu Pareto; porównania wewnątrz tabeli pozostają jednak w pełni uprawnione, gdyż wszystkie tryby różnią się wyłącznie sposobem rozmieszczenia wody, populacji i baz.</w:t>
+      </w:r>
+    </w:p>
+    <w:p>
+      <w:r>
+        <w:t xml:space="preserve">Szczególnie pouczający okazał się tryb z bazami ustawionymi obok siebie. Jego surowe metryki nierównowagi były najniższe z całego zestawienia (terytorialna 0,9%, militarna 4,1%), ponieważ rozgrywka kończy się, zanim którakolwiek ze stron zdąży zbudować przewagę. Bez zabezpieczenia mapa taka otrzymałaby ocenę wysoką. Odrzuciła ją dopiero bramka poprawności oparta na wskaźniku podboju, który wyniósł 6,2% wobec progu 60%. Stanowi to empiryczne uzasadnienie decyzji z rozdziału 7.5.A o przeniesieniu tej metryki z wejść systemu do warunków dopuszczenia wyniku. Ten sam tryb dostarcza ponadto niezależnego argumentu przeciwko wykorzystywaniu punktów kulminacyjnych jako wejścia kryterium dynamizmu: przy najniższej w całym zestawieniu średniej nierównowadze terytorialnej wynoszącej 0,9% osiąga on zarazem najwyższą amplitudę wahnięcia, równą 100,9%, podczas gdy mapa idealnie symetryczna osiąga 81,6%. Wynika to z normalizacji zastosowanej we wzorze (7): gdy w początkowej fazie meczu każdy z botów kontroluje pojedyncze pola, zdobycie jednego kafelka daje bardzo wysoką wartość względną, więc na mapie rozstrzyganej po kilkudziesięciu turach metryka mierzy niemal wyłącznie zmienność fazy startowej.</w:t>
+      </w:r>
+    </w:p>
+    <w:p>
+      <w:r>
+        <w:t xml:space="preserve">Po skorygowaniu punktu nasycenia zbiorów WYSOKI oceny końcowe układają się w oczekiwanej kolejności: mapa wzorcowa 0,4148, mapa losowa 0,1644, mapy zaburzone od 0,1419 do 0,0000. Oba warunki weryfikacji — wzorzec nie gorszy od mapy losowej oraz mapa losowa lepsza od najlepszej z zaburzonych — są spełnione. Zmiana definicji metryk wyraźnie zwiększyła przy tym rozdzielczość oceny: przed nią mapa z bogatą strefą i mapa z bazą w rogu otrzymywały dynamizm odpowiednio 0,1540 oraz 0,1565, czyli wartości nierozróżnialne, natomiast po zmianie 0,1429 oraz 0,3480, co daje odstęp ponad osiemdziesięciokrotnie większy. Odpowiada to różnicy merytorycznej między tymi trybami: na mapie z bazą w rogu rozgrywka faktycznie się toczy i front się przesuwa, podczas gdy mapa z bogatą strefą zostaje rozstrzygnięta szybko i jednostronnie.</w:t>
+      </w:r>
+    </w:p>
+    <w:p>
+      <w:r>
+        <w:t xml:space="preserve">Weryfikację powtórzono następnie w drugim wariancie, zmieniając wyłącznie zestaw genów: zamiast wartości historycznych 12 / 60 / 700 użyto 11 / 96 / 447, czyli rozwiązania o najwyższym balansie z frontu Pareto. Plansze, tryby oraz liczba meczów pozostały bez zmian. Wariant ten ma charakter rozstrzygający, ponieważ dopiero on pozwala odpowiedzieć na pytanie, czy mapa skonstruowana jako obiektywnie sprawiedliwa wypada lepiej od losowej przy najlepszych znanych parametrach świata.</w:t>
+      </w:r>
+    </w:p>
+    <w:p>
+      <w:r>
+        <w:t xml:space="preserve">Mapa wzorcowa uzyskała ocenę balansu 0,8475 oraz dynamizmu 0,8667, co odpowiada 97,8% i 100,0% matematycznego sufitu wyjścia systemu. Jej surowe nierównowagi — terytorialna 6,4%, gospodarcza 8,1% i militarna 8,9% — są najniższe spośród wszystkich zaobserwowanych w projekcie. Generator losowy przy tych samych genach osiągnął balans 0,8320, a najlepsze rozwiązanie znalezione przez NSGA-II w 408 ocenach — 0,8418. Funkcja przystosowania przyznaje zatem najwyższą ocenę mapie, o której z konstrukcji wiadomo, że jest sprawiedliwa, mimo że mapa ta nie brała udziału w optymalizacji. Same różnice ocen mieszczą się w granicach od 1,5 do 1,8 odchylenia standardowego, natomiast rozstrzygające są surowe metryki, obarczone mniejszym błędem względnym: nierównowaga terytorialna spada z 9,4% do 6,4%, czyli o jedną trzecią, a wszystkie trzy metryki balansu zmieniają się w tym samym kierunku.</w:t>
+      </w:r>
+    </w:p>
+    <w:p>
+      <w:r>
+        <w:t xml:space="preserve">Zestawienie obu wariantów prowadzi do trzech dalszych wniosków. Po pierwsze, wcześniejszy słaby wynik mapy wzorcowej wynikał z doboru parametrów, a nie z właściwości planszy: ta sama mapa uzyskuje 0,4148 przy genach 12 / 60 / 700 oraz 0,8475 przy 11 / 96 / 447. Po drugie, asymetria przestrzenna okazuje się możliwa do skompensowania parametrami świata, natomiast asymetria zasobowa nie: tryb z bazą zepchniętą w róg poprawia balans z 0,1419 do 0,6058, podczas gdy tryb z bogatą strefą przy jednej z baz jedynie z 0,1378 do 0,1474. Wynika stąd wskazówka projektowa mówiąca, że rozmieszczenie zasobów wymaga większej staranności niż rozmieszczenie pozycji startowych, ponieważ błędu popełnionego w pierwszym z tych wymiarów nie da się naprawić strojeniem ekonomii. Po trzecie, dolna granica mierzalnej nierównowagi sama zależy od parametrów świata: w świecie ubogim i przy drogich jednostkach pojedyncze przegrane starcie ma duży wpływ na dalszy przebieg, więc nawet plansza idealnie symetryczna kończy z nierównowagą rzędu 14%, podczas gdy w świecie bogatym i przy tanich jednostkach ta sama plansza schodzi do 6,4%. Udział mapy w wyniku rośnie zatem wraz z zamożnością świata, ponieważ maleje udział przypadku.</w:t>
+      </w:r>
+    </w:p>
+    <w:p>
+      <w:r>
+        <w:t xml:space="preserve">Bramka poprawności zachowuje swoją funkcję również w rejonie optimum. Tryb z bazami ustawionymi obok siebie rozwija się przy korzystnych parametrach wyraźnie bardziej niż poprzednio, osiągając wskaźnik podboju 32,5% wobec 6,2%, jednak nadal pozostaje poniżej progu 60% i zostaje odrzucony. Tryb ten po raz kolejny uzyskuje też najwyższą w zestawieniu amplitudę wahnięcia przewagi, równą 107,3% wobec 61,2% dla mapy wzorcowej, co stanowi kolejne potwierdzenie obserwacji z rozdziału 7.5.D.</w:t>
+      </w:r>
+    </w:p>
+    <w:p>
+      <w:r>
+        <w:t xml:space="preserve">Należy zaznaczyć, że skala ocen pozostaje względna wobec rozkładu zaobserwowanego w badaniu pilotażowym. Mapa z bogatą strefą osiąga Growth Imbalance na poziomie 58,3%, podczas gdy generator normalny wytwarza wartości z przedziału 12,0–32,5%, znajduje się więc poza zakresem kalibracji i nadal ulega nasyceniu. Nie jest to wada, lecz właściwość przyjętej metody: system kalibrowano po to, by rozróżniał mapy rzeczywiście wytwarzane przez generator, a nie by mierzył patologie w skali bezwzględnej. Z tego powodu w analizie map kontrolnych podaje się zarówno surowe metryki, jak i ocenę rozmytą. Osobnej uwagi wymaga wynik mapy wzorcowej: mimo idealnej symetrii obrotowej osiąga ona nierównowagę terytorialną 14,0% oraz militarną 20,0%, czyli wartości odpowiadające medianie rozkładu z pilotażu. Mapa gwarantuje tożsame warunki startowe, lecz nie tożsamy przebieg rozgrywki — losowy mnożnik strat w walce oraz zależność dalszych zdarzeń od pojedynczych rozstrzygnięć generują rozbieżność samoistnie. Zmierzona nierównowaga ma zatem nieusuwalną dolną granicę wynikającą z losowości symulacji, a nie z geometrii planszy; nawet przy hipotetycznym wyzerowaniu nierównowagi militarnej ocena balansu mapy wzorcowej zatrzymałaby się na poziomie 0,5407.</w:t>
       </w:r>
     </w:p>
     <w:sectPr>

</xml_diff>